<commit_message>
Updated the getting started document based on the comments
</commit_message>
<xml_diff>
--- a/Getting Started with PAX Fabric - Enterprise AI Analytics Pipeline (Public).docx
+++ b/Getting Started with PAX Fabric - Enterprise AI Analytics Pipeline (Public).docx
@@ -32,7 +32,6 @@
     </w:p>
     <w:p>
       <w:pPr>
-        <w:spacing w:after="120"/>
         <w:rPr>
           <w:rFonts w:asciiTheme="minorHAnsi" w:hAnsiTheme="minorHAnsi"/>
         </w:rPr>
@@ -43,15 +42,58 @@
           <w:b/>
           <w:bCs/>
         </w:rPr>
-        <w:t>PAX Fabric - Enterprise AI Analytics Pipeline</w:t>
-      </w:r>
-      <w:r>
-        <w:rPr>
-          <w:rFonts w:asciiTheme="minorHAnsi" w:hAnsiTheme="minorHAnsi"/>
-        </w:rPr>
-        <w:t xml:space="preserve"> is an enterprise analytics workload for Microsoft Fabric that helps organizations collect, process, and prepare tenant-wide activity, usage, consumption, user, and agent data for reporting and analysis. </w:t>
-      </w:r>
-    </w:p>
+        <w:t>Document version:</w:t>
+      </w:r>
+      <w:r>
+        <w:rPr>
+          <w:rFonts w:asciiTheme="minorHAnsi" w:hAnsiTheme="minorHAnsi"/>
+        </w:rPr>
+        <w:t xml:space="preserve"> 1.1</w:t>
+      </w:r>
+    </w:p>
+    <w:p>
+      <w:pPr>
+        <w:rPr>
+          <w:rFonts w:asciiTheme="minorHAnsi" w:hAnsiTheme="minorHAnsi"/>
+        </w:rPr>
+      </w:pPr>
+      <w:r>
+        <w:rPr>
+          <w:rFonts w:asciiTheme="minorHAnsi" w:hAnsiTheme="minorHAnsi"/>
+          <w:b/>
+          <w:bCs/>
+        </w:rPr>
+        <w:t>Updated:</w:t>
+      </w:r>
+      <w:r>
+        <w:rPr>
+          <w:rFonts w:asciiTheme="minorHAnsi" w:hAnsiTheme="minorHAnsi"/>
+        </w:rPr>
+        <w:t xml:space="preserve"> October 13, 2026</w:t>
+      </w:r>
+    </w:p>
+    <w:p>
+      <w:pPr>
+        <w:rPr>
+          <w:rFonts w:asciiTheme="minorHAnsi" w:hAnsiTheme="minorHAnsi"/>
+        </w:rPr>
+      </w:pPr>
+      <w:r>
+        <w:rPr>
+          <w:rFonts w:asciiTheme="minorHAnsi" w:hAnsiTheme="minorHAnsi"/>
+          <w:b/>
+          <w:bCs/>
+        </w:rPr>
+        <w:t>PAX parity:</w:t>
+      </w:r>
+      <w:r>
+        <w:rPr>
+          <w:rFonts w:asciiTheme="minorHAnsi" w:hAnsiTheme="minorHAnsi"/>
+        </w:rPr>
+        <w:t xml:space="preserve"> v1.11.16-prerelease-20260916-06</w:t>
+      </w:r>
+    </w:p>
+    <w:p/>
     <w:p>
       <w:pPr>
         <w:spacing w:after="120"/>
@@ -62,6 +104,28 @@
       <w:r>
         <w:rPr>
           <w:rFonts w:asciiTheme="minorHAnsi" w:hAnsiTheme="minorHAnsi"/>
+          <w:b/>
+          <w:bCs/>
+        </w:rPr>
+        <w:t>PAX Fabric is an enterprise analytics workload for Microsoft Fabric that helps organizations collect, process, and prepare tenant-wide AI activity, Microsoft 365 usage, user, and agent data for reporting and analysis.</w:t>
+      </w:r>
+      <w:r>
+        <w:rPr>
+          <w:rFonts w:asciiTheme="minorHAnsi" w:hAnsiTheme="minorHAnsi"/>
+        </w:rPr>
+        <w:t xml:space="preserve"> </w:t>
+      </w:r>
+    </w:p>
+    <w:p>
+      <w:pPr>
+        <w:spacing w:after="120"/>
+        <w:rPr>
+          <w:rFonts w:asciiTheme="minorHAnsi" w:hAnsiTheme="minorHAnsi"/>
+        </w:rPr>
+      </w:pPr>
+      <w:r>
+        <w:rPr>
+          <w:rFonts w:asciiTheme="minorHAnsi" w:hAnsiTheme="minorHAnsi"/>
         </w:rPr>
         <w:t>The workload provides a managed experience for deploying the required Fabric resources, configuring data collection, running the pipeline on demand or on a schedule, monitoring execution, and connecting the resulting Lakehouse data to ready-to-use reporting templates.</w:t>
       </w:r>
@@ -77,7 +141,19 @@
         <w:rPr>
           <w:rFonts w:asciiTheme="minorHAnsi" w:hAnsiTheme="minorHAnsi"/>
         </w:rPr>
-        <w:t xml:space="preserve"> PAX Fabric - Enterprise AI Analytics Pipeline runs natively in Microsoft Fabric. Collected and processed data is stored as Delta tables in OneLake, allowing organizations to maintain their analytics workflow within their Fabric environment.</w:t>
+        <w:t xml:space="preserve"> </w:t>
+      </w:r>
+      <w:r>
+        <w:rPr>
+          <w:rFonts w:asciiTheme="minorHAnsi" w:hAnsiTheme="minorHAnsi"/>
+        </w:rPr>
+        <w:t>PAX Fabric runs natively in Microsoft Fabric.</w:t>
+      </w:r>
+      <w:r>
+        <w:rPr>
+          <w:rFonts w:asciiTheme="minorHAnsi" w:hAnsiTheme="minorHAnsi"/>
+        </w:rPr>
+        <w:t xml:space="preserve"> Collected and processed data is stored as Delta tables in OneLake, allowing organizations to maintain their analytics workflow within their Fabric environment.</w:t>
       </w:r>
       <w:r>
         <w:rPr>
@@ -132,98 +208,87 @@
               <w:tab w:val="right" w:leader="dot" w:pos="9016"/>
             </w:tabs>
             <w:rPr>
-              <w:rFonts w:asciiTheme="minorHAnsi" w:hAnsiTheme="minorHAnsi"/>
+              <w:rFonts w:asciiTheme="minorHAnsi" w:eastAsiaTheme="minorEastAsia" w:hAnsiTheme="minorHAnsi" w:cstheme="minorBidi"/>
               <w:noProof/>
-              <w:color w:val="000000" w:themeColor="text1"/>
+              <w:kern w:val="2"/>
+              <w14:ligatures w14:val="standardContextual"/>
             </w:rPr>
           </w:pPr>
           <w:r>
             <w:rPr>
+              <w:rFonts w:asciiTheme="minorHAnsi" w:hAnsiTheme="minorHAnsi"/>
               <w:color w:val="000000" w:themeColor="text1"/>
             </w:rPr>
             <w:fldChar w:fldCharType="begin"/>
           </w:r>
           <w:r>
             <w:rPr>
+              <w:rFonts w:asciiTheme="minorHAnsi" w:hAnsiTheme="minorHAnsi"/>
               <w:color w:val="000000" w:themeColor="text1"/>
             </w:rPr>
             <w:instrText xml:space="preserve"> TOC \o "1-3" \h \z \u </w:instrText>
           </w:r>
           <w:r>
             <w:rPr>
+              <w:rFonts w:asciiTheme="minorHAnsi" w:hAnsiTheme="minorHAnsi"/>
               <w:color w:val="000000" w:themeColor="text1"/>
             </w:rPr>
             <w:fldChar w:fldCharType="separate"/>
           </w:r>
-          <w:hyperlink w:anchor="_Toc242260270" w:history="1">
+          <w:hyperlink w:anchor="_Toc242782503" w:history="1">
             <w:r>
               <w:rPr>
                 <w:rStyle w:val="Hyperlink"/>
-                <w:rFonts w:asciiTheme="minorHAnsi" w:hAnsiTheme="minorHAnsi"/>
-                <w:noProof/>
-                <w:color w:val="000000" w:themeColor="text1"/>
-              </w:rPr>
-              <w:t>What You Can Do with PAX Fabric - Enterprise AI Analytics Pipeline</w:t>
-            </w:r>
-            <w:r>
-              <w:rPr>
-                <w:rFonts w:asciiTheme="minorHAnsi" w:hAnsiTheme="minorHAnsi"/>
-                <w:noProof/>
-                <w:webHidden/>
-                <w:color w:val="000000" w:themeColor="text1"/>
+                <w:rFonts w:asciiTheme="majorHAnsi" w:hAnsiTheme="majorHAnsi"/>
+                <w:noProof/>
+              </w:rPr>
+              <w:t>What You Can Do with PAX Fabric</w:t>
+            </w:r>
+            <w:r>
+              <w:rPr>
+                <w:noProof/>
+                <w:webHidden/>
               </w:rPr>
               <w:tab/>
             </w:r>
             <w:r>
               <w:rPr>
-                <w:rFonts w:asciiTheme="minorHAnsi" w:hAnsiTheme="minorHAnsi"/>
-                <w:noProof/>
-                <w:webHidden/>
-                <w:color w:val="000000" w:themeColor="text1"/>
+                <w:noProof/>
+                <w:webHidden/>
               </w:rPr>
               <w:fldChar w:fldCharType="begin"/>
             </w:r>
             <w:r>
               <w:rPr>
-                <w:rFonts w:asciiTheme="minorHAnsi" w:hAnsiTheme="minorHAnsi"/>
-                <w:noProof/>
-                <w:webHidden/>
-                <w:color w:val="000000" w:themeColor="text1"/>
-              </w:rPr>
-              <w:instrText xml:space="preserve"> PAGEREF _Toc242260270 \h </w:instrText>
-            </w:r>
-            <w:r>
-              <w:rPr>
-                <w:rFonts w:asciiTheme="minorHAnsi" w:hAnsiTheme="minorHAnsi"/>
-                <w:noProof/>
-                <w:webHidden/>
-                <w:color w:val="000000" w:themeColor="text1"/>
-              </w:rPr>
-            </w:r>
-            <w:r>
-              <w:rPr>
-                <w:rFonts w:asciiTheme="minorHAnsi" w:hAnsiTheme="minorHAnsi"/>
-                <w:noProof/>
-                <w:webHidden/>
-                <w:color w:val="000000" w:themeColor="text1"/>
+                <w:noProof/>
+                <w:webHidden/>
+              </w:rPr>
+              <w:instrText xml:space="preserve"> PAGEREF _Toc242782503 \h </w:instrText>
+            </w:r>
+            <w:r>
+              <w:rPr>
+                <w:noProof/>
+                <w:webHidden/>
+              </w:rPr>
+            </w:r>
+            <w:r>
+              <w:rPr>
+                <w:noProof/>
+                <w:webHidden/>
               </w:rPr>
               <w:fldChar w:fldCharType="separate"/>
             </w:r>
             <w:r>
               <w:rPr>
-                <w:rFonts w:asciiTheme="minorHAnsi" w:hAnsiTheme="minorHAnsi"/>
-                <w:noProof/>
-                <w:webHidden/>
-                <w:color w:val="000000" w:themeColor="text1"/>
-              </w:rPr>
-              <w:t>1</w:t>
-            </w:r>
-            <w:r>
-              <w:rPr>
-                <w:rFonts w:asciiTheme="minorHAnsi" w:hAnsiTheme="minorHAnsi"/>
-                <w:noProof/>
-                <w:webHidden/>
-                <w:color w:val="000000" w:themeColor="text1"/>
+                <w:noProof/>
+                <w:webHidden/>
+              </w:rPr>
+              <w:t>2</w:t>
+            </w:r>
+            <w:r>
+              <w:rPr>
+                <w:noProof/>
+                <w:webHidden/>
               </w:rPr>
               <w:fldChar w:fldCharType="end"/>
             </w:r>
@@ -236,80 +301,66 @@
               <w:tab w:val="right" w:leader="dot" w:pos="9016"/>
             </w:tabs>
             <w:rPr>
-              <w:rFonts w:asciiTheme="minorHAnsi" w:hAnsiTheme="minorHAnsi"/>
+              <w:rFonts w:asciiTheme="minorHAnsi" w:eastAsiaTheme="minorEastAsia" w:hAnsiTheme="minorHAnsi" w:cstheme="minorBidi"/>
               <w:noProof/>
-              <w:color w:val="000000" w:themeColor="text1"/>
+              <w:kern w:val="2"/>
+              <w14:ligatures w14:val="standardContextual"/>
             </w:rPr>
           </w:pPr>
-          <w:hyperlink w:anchor="_Toc242260271" w:history="1">
+          <w:hyperlink w:anchor="_Toc242782504" w:history="1">
             <w:r>
               <w:rPr>
                 <w:rStyle w:val="Hyperlink"/>
-                <w:rFonts w:asciiTheme="minorHAnsi" w:hAnsiTheme="minorHAnsi"/>
-                <w:noProof/>
-                <w:color w:val="000000" w:themeColor="text1"/>
-              </w:rPr>
-              <w:t>How PAX Fabric - Enterprise AI Analytics Pipeline Works</w:t>
-            </w:r>
-            <w:r>
-              <w:rPr>
-                <w:rFonts w:asciiTheme="minorHAnsi" w:hAnsiTheme="minorHAnsi"/>
-                <w:noProof/>
-                <w:webHidden/>
-                <w:color w:val="000000" w:themeColor="text1"/>
+                <w:rFonts w:asciiTheme="majorHAnsi" w:hAnsiTheme="majorHAnsi"/>
+                <w:noProof/>
+              </w:rPr>
+              <w:t>How PAX Fabric Works</w:t>
+            </w:r>
+            <w:r>
+              <w:rPr>
+                <w:noProof/>
+                <w:webHidden/>
               </w:rPr>
               <w:tab/>
             </w:r>
             <w:r>
               <w:rPr>
-                <w:rFonts w:asciiTheme="minorHAnsi" w:hAnsiTheme="minorHAnsi"/>
-                <w:noProof/>
-                <w:webHidden/>
-                <w:color w:val="000000" w:themeColor="text1"/>
+                <w:noProof/>
+                <w:webHidden/>
               </w:rPr>
               <w:fldChar w:fldCharType="begin"/>
             </w:r>
             <w:r>
               <w:rPr>
-                <w:rFonts w:asciiTheme="minorHAnsi" w:hAnsiTheme="minorHAnsi"/>
-                <w:noProof/>
-                <w:webHidden/>
-                <w:color w:val="000000" w:themeColor="text1"/>
-              </w:rPr>
-              <w:instrText xml:space="preserve"> PAGEREF _Toc242260271 \h </w:instrText>
-            </w:r>
-            <w:r>
-              <w:rPr>
-                <w:rFonts w:asciiTheme="minorHAnsi" w:hAnsiTheme="minorHAnsi"/>
-                <w:noProof/>
-                <w:webHidden/>
-                <w:color w:val="000000" w:themeColor="text1"/>
-              </w:rPr>
-            </w:r>
-            <w:r>
-              <w:rPr>
-                <w:rFonts w:asciiTheme="minorHAnsi" w:hAnsiTheme="minorHAnsi"/>
-                <w:noProof/>
-                <w:webHidden/>
-                <w:color w:val="000000" w:themeColor="text1"/>
+                <w:noProof/>
+                <w:webHidden/>
+              </w:rPr>
+              <w:instrText xml:space="preserve"> PAGEREF _Toc242782504 \h </w:instrText>
+            </w:r>
+            <w:r>
+              <w:rPr>
+                <w:noProof/>
+                <w:webHidden/>
+              </w:rPr>
+            </w:r>
+            <w:r>
+              <w:rPr>
+                <w:noProof/>
+                <w:webHidden/>
               </w:rPr>
               <w:fldChar w:fldCharType="separate"/>
             </w:r>
             <w:r>
               <w:rPr>
-                <w:rFonts w:asciiTheme="minorHAnsi" w:hAnsiTheme="minorHAnsi"/>
-                <w:noProof/>
-                <w:webHidden/>
-                <w:color w:val="000000" w:themeColor="text1"/>
+                <w:noProof/>
+                <w:webHidden/>
               </w:rPr>
               <w:t>2</w:t>
             </w:r>
             <w:r>
               <w:rPr>
-                <w:rFonts w:asciiTheme="minorHAnsi" w:hAnsiTheme="minorHAnsi"/>
-                <w:noProof/>
-                <w:webHidden/>
-                <w:color w:val="000000" w:themeColor="text1"/>
+                <w:noProof/>
+                <w:webHidden/>
               </w:rPr>
               <w:fldChar w:fldCharType="end"/>
             </w:r>
@@ -322,80 +373,66 @@
               <w:tab w:val="right" w:leader="dot" w:pos="9016"/>
             </w:tabs>
             <w:rPr>
-              <w:rFonts w:asciiTheme="minorHAnsi" w:hAnsiTheme="minorHAnsi"/>
+              <w:rFonts w:asciiTheme="minorHAnsi" w:eastAsiaTheme="minorEastAsia" w:hAnsiTheme="minorHAnsi" w:cstheme="minorBidi"/>
               <w:noProof/>
-              <w:color w:val="000000" w:themeColor="text1"/>
+              <w:kern w:val="2"/>
+              <w14:ligatures w14:val="standardContextual"/>
             </w:rPr>
           </w:pPr>
-          <w:hyperlink w:anchor="_Toc242260272" w:history="1">
+          <w:hyperlink w:anchor="_Toc242782505" w:history="1">
             <w:r>
               <w:rPr>
                 <w:rStyle w:val="Hyperlink"/>
-                <w:rFonts w:asciiTheme="minorHAnsi" w:hAnsiTheme="minorHAnsi"/>
-                <w:noProof/>
-                <w:color w:val="000000" w:themeColor="text1"/>
+                <w:rFonts w:asciiTheme="majorHAnsi" w:hAnsiTheme="majorHAnsi"/>
+                <w:noProof/>
               </w:rPr>
               <w:t>End-to-End Workload Flow</w:t>
             </w:r>
             <w:r>
               <w:rPr>
-                <w:rFonts w:asciiTheme="minorHAnsi" w:hAnsiTheme="minorHAnsi"/>
-                <w:noProof/>
-                <w:webHidden/>
-                <w:color w:val="000000" w:themeColor="text1"/>
+                <w:noProof/>
+                <w:webHidden/>
               </w:rPr>
               <w:tab/>
             </w:r>
             <w:r>
               <w:rPr>
-                <w:rFonts w:asciiTheme="minorHAnsi" w:hAnsiTheme="minorHAnsi"/>
-                <w:noProof/>
-                <w:webHidden/>
-                <w:color w:val="000000" w:themeColor="text1"/>
+                <w:noProof/>
+                <w:webHidden/>
               </w:rPr>
               <w:fldChar w:fldCharType="begin"/>
             </w:r>
             <w:r>
               <w:rPr>
-                <w:rFonts w:asciiTheme="minorHAnsi" w:hAnsiTheme="minorHAnsi"/>
-                <w:noProof/>
-                <w:webHidden/>
-                <w:color w:val="000000" w:themeColor="text1"/>
-              </w:rPr>
-              <w:instrText xml:space="preserve"> PAGEREF _Toc242260272 \h </w:instrText>
-            </w:r>
-            <w:r>
-              <w:rPr>
-                <w:rFonts w:asciiTheme="minorHAnsi" w:hAnsiTheme="minorHAnsi"/>
-                <w:noProof/>
-                <w:webHidden/>
-                <w:color w:val="000000" w:themeColor="text1"/>
-              </w:rPr>
-            </w:r>
-            <w:r>
-              <w:rPr>
-                <w:rFonts w:asciiTheme="minorHAnsi" w:hAnsiTheme="minorHAnsi"/>
-                <w:noProof/>
-                <w:webHidden/>
-                <w:color w:val="000000" w:themeColor="text1"/>
+                <w:noProof/>
+                <w:webHidden/>
+              </w:rPr>
+              <w:instrText xml:space="preserve"> PAGEREF _Toc242782505 \h </w:instrText>
+            </w:r>
+            <w:r>
+              <w:rPr>
+                <w:noProof/>
+                <w:webHidden/>
+              </w:rPr>
+            </w:r>
+            <w:r>
+              <w:rPr>
+                <w:noProof/>
+                <w:webHidden/>
               </w:rPr>
               <w:fldChar w:fldCharType="separate"/>
             </w:r>
             <w:r>
               <w:rPr>
-                <w:rFonts w:asciiTheme="minorHAnsi" w:hAnsiTheme="minorHAnsi"/>
-                <w:noProof/>
-                <w:webHidden/>
-                <w:color w:val="000000" w:themeColor="text1"/>
+                <w:noProof/>
+                <w:webHidden/>
               </w:rPr>
               <w:t>2</w:t>
             </w:r>
             <w:r>
               <w:rPr>
-                <w:rFonts w:asciiTheme="minorHAnsi" w:hAnsiTheme="minorHAnsi"/>
-                <w:noProof/>
-                <w:webHidden/>
-                <w:color w:val="000000" w:themeColor="text1"/>
+                <w:noProof/>
+                <w:webHidden/>
               </w:rPr>
               <w:fldChar w:fldCharType="end"/>
             </w:r>
@@ -408,80 +445,66 @@
               <w:tab w:val="right" w:leader="dot" w:pos="9016"/>
             </w:tabs>
             <w:rPr>
-              <w:rFonts w:asciiTheme="minorHAnsi" w:hAnsiTheme="minorHAnsi"/>
+              <w:rFonts w:asciiTheme="minorHAnsi" w:eastAsiaTheme="minorEastAsia" w:hAnsiTheme="minorHAnsi" w:cstheme="minorBidi"/>
               <w:noProof/>
-              <w:color w:val="000000" w:themeColor="text1"/>
+              <w:kern w:val="2"/>
+              <w14:ligatures w14:val="standardContextual"/>
             </w:rPr>
           </w:pPr>
-          <w:hyperlink w:anchor="_Toc242260273" w:history="1">
+          <w:hyperlink w:anchor="_Toc242782506" w:history="1">
             <w:r>
               <w:rPr>
                 <w:rStyle w:val="Hyperlink"/>
-                <w:rFonts w:asciiTheme="minorHAnsi" w:hAnsiTheme="minorHAnsi"/>
-                <w:noProof/>
-                <w:color w:val="000000" w:themeColor="text1"/>
-              </w:rPr>
-              <w:t>Fabric Resources Flow</w:t>
-            </w:r>
-            <w:r>
-              <w:rPr>
-                <w:rFonts w:asciiTheme="minorHAnsi" w:hAnsiTheme="minorHAnsi"/>
-                <w:noProof/>
-                <w:webHidden/>
-                <w:color w:val="000000" w:themeColor="text1"/>
+                <w:rFonts w:asciiTheme="majorHAnsi" w:hAnsiTheme="majorHAnsi"/>
+                <w:noProof/>
+              </w:rPr>
+              <w:t>Solution Resources and Services Flow</w:t>
+            </w:r>
+            <w:r>
+              <w:rPr>
+                <w:noProof/>
+                <w:webHidden/>
               </w:rPr>
               <w:tab/>
             </w:r>
             <w:r>
               <w:rPr>
-                <w:rFonts w:asciiTheme="minorHAnsi" w:hAnsiTheme="minorHAnsi"/>
-                <w:noProof/>
-                <w:webHidden/>
-                <w:color w:val="000000" w:themeColor="text1"/>
+                <w:noProof/>
+                <w:webHidden/>
               </w:rPr>
               <w:fldChar w:fldCharType="begin"/>
             </w:r>
             <w:r>
               <w:rPr>
-                <w:rFonts w:asciiTheme="minorHAnsi" w:hAnsiTheme="minorHAnsi"/>
-                <w:noProof/>
-                <w:webHidden/>
-                <w:color w:val="000000" w:themeColor="text1"/>
-              </w:rPr>
-              <w:instrText xml:space="preserve"> PAGEREF _Toc242260273 \h </w:instrText>
-            </w:r>
-            <w:r>
-              <w:rPr>
-                <w:rFonts w:asciiTheme="minorHAnsi" w:hAnsiTheme="minorHAnsi"/>
-                <w:noProof/>
-                <w:webHidden/>
-                <w:color w:val="000000" w:themeColor="text1"/>
-              </w:rPr>
-            </w:r>
-            <w:r>
-              <w:rPr>
-                <w:rFonts w:asciiTheme="minorHAnsi" w:hAnsiTheme="minorHAnsi"/>
-                <w:noProof/>
-                <w:webHidden/>
-                <w:color w:val="000000" w:themeColor="text1"/>
+                <w:noProof/>
+                <w:webHidden/>
+              </w:rPr>
+              <w:instrText xml:space="preserve"> PAGEREF _Toc242782506 \h </w:instrText>
+            </w:r>
+            <w:r>
+              <w:rPr>
+                <w:noProof/>
+                <w:webHidden/>
+              </w:rPr>
+            </w:r>
+            <w:r>
+              <w:rPr>
+                <w:noProof/>
+                <w:webHidden/>
               </w:rPr>
               <w:fldChar w:fldCharType="separate"/>
             </w:r>
             <w:r>
               <w:rPr>
-                <w:rFonts w:asciiTheme="minorHAnsi" w:hAnsiTheme="minorHAnsi"/>
-                <w:noProof/>
-                <w:webHidden/>
-                <w:color w:val="000000" w:themeColor="text1"/>
+                <w:noProof/>
+                <w:webHidden/>
               </w:rPr>
               <w:t>2</w:t>
             </w:r>
             <w:r>
               <w:rPr>
-                <w:rFonts w:asciiTheme="minorHAnsi" w:hAnsiTheme="minorHAnsi"/>
-                <w:noProof/>
-                <w:webHidden/>
-                <w:color w:val="000000" w:themeColor="text1"/>
+                <w:noProof/>
+                <w:webHidden/>
               </w:rPr>
               <w:fldChar w:fldCharType="end"/>
             </w:r>
@@ -494,80 +517,66 @@
               <w:tab w:val="right" w:leader="dot" w:pos="9016"/>
             </w:tabs>
             <w:rPr>
-              <w:rFonts w:asciiTheme="minorHAnsi" w:hAnsiTheme="minorHAnsi"/>
+              <w:rFonts w:asciiTheme="minorHAnsi" w:eastAsiaTheme="minorEastAsia" w:hAnsiTheme="minorHAnsi" w:cstheme="minorBidi"/>
               <w:noProof/>
-              <w:color w:val="000000" w:themeColor="text1"/>
+              <w:kern w:val="2"/>
+              <w14:ligatures w14:val="standardContextual"/>
             </w:rPr>
           </w:pPr>
-          <w:hyperlink w:anchor="_Toc242260274" w:history="1">
+          <w:hyperlink w:anchor="_Toc242782507" w:history="1">
             <w:r>
               <w:rPr>
                 <w:rStyle w:val="Hyperlink"/>
-                <w:rFonts w:asciiTheme="minorHAnsi" w:hAnsiTheme="minorHAnsi"/>
-                <w:noProof/>
-                <w:color w:val="000000" w:themeColor="text1"/>
+                <w:rFonts w:asciiTheme="majorHAnsi" w:hAnsiTheme="majorHAnsi"/>
+                <w:noProof/>
               </w:rPr>
               <w:t>Resources Created by the Workload</w:t>
             </w:r>
             <w:r>
               <w:rPr>
-                <w:rFonts w:asciiTheme="minorHAnsi" w:hAnsiTheme="minorHAnsi"/>
-                <w:noProof/>
-                <w:webHidden/>
-                <w:color w:val="000000" w:themeColor="text1"/>
+                <w:noProof/>
+                <w:webHidden/>
               </w:rPr>
               <w:tab/>
             </w:r>
             <w:r>
               <w:rPr>
-                <w:rFonts w:asciiTheme="minorHAnsi" w:hAnsiTheme="minorHAnsi"/>
-                <w:noProof/>
-                <w:webHidden/>
-                <w:color w:val="000000" w:themeColor="text1"/>
+                <w:noProof/>
+                <w:webHidden/>
               </w:rPr>
               <w:fldChar w:fldCharType="begin"/>
             </w:r>
             <w:r>
               <w:rPr>
-                <w:rFonts w:asciiTheme="minorHAnsi" w:hAnsiTheme="minorHAnsi"/>
-                <w:noProof/>
-                <w:webHidden/>
-                <w:color w:val="000000" w:themeColor="text1"/>
-              </w:rPr>
-              <w:instrText xml:space="preserve"> PAGEREF _Toc242260274 \h </w:instrText>
-            </w:r>
-            <w:r>
-              <w:rPr>
-                <w:rFonts w:asciiTheme="minorHAnsi" w:hAnsiTheme="minorHAnsi"/>
-                <w:noProof/>
-                <w:webHidden/>
-                <w:color w:val="000000" w:themeColor="text1"/>
-              </w:rPr>
-            </w:r>
-            <w:r>
-              <w:rPr>
-                <w:rFonts w:asciiTheme="minorHAnsi" w:hAnsiTheme="minorHAnsi"/>
-                <w:noProof/>
-                <w:webHidden/>
-                <w:color w:val="000000" w:themeColor="text1"/>
+                <w:noProof/>
+                <w:webHidden/>
+              </w:rPr>
+              <w:instrText xml:space="preserve"> PAGEREF _Toc242782507 \h </w:instrText>
+            </w:r>
+            <w:r>
+              <w:rPr>
+                <w:noProof/>
+                <w:webHidden/>
+              </w:rPr>
+            </w:r>
+            <w:r>
+              <w:rPr>
+                <w:noProof/>
+                <w:webHidden/>
               </w:rPr>
               <w:fldChar w:fldCharType="separate"/>
             </w:r>
             <w:r>
               <w:rPr>
-                <w:rFonts w:asciiTheme="minorHAnsi" w:hAnsiTheme="minorHAnsi"/>
-                <w:noProof/>
-                <w:webHidden/>
-                <w:color w:val="000000" w:themeColor="text1"/>
-              </w:rPr>
-              <w:t>2</w:t>
-            </w:r>
-            <w:r>
-              <w:rPr>
-                <w:rFonts w:asciiTheme="minorHAnsi" w:hAnsiTheme="minorHAnsi"/>
-                <w:noProof/>
-                <w:webHidden/>
-                <w:color w:val="000000" w:themeColor="text1"/>
+                <w:noProof/>
+                <w:webHidden/>
+              </w:rPr>
+              <w:t>3</w:t>
+            </w:r>
+            <w:r>
+              <w:rPr>
+                <w:noProof/>
+                <w:webHidden/>
               </w:rPr>
               <w:fldChar w:fldCharType="end"/>
             </w:r>
@@ -580,80 +589,66 @@
               <w:tab w:val="right" w:leader="dot" w:pos="9016"/>
             </w:tabs>
             <w:rPr>
-              <w:rFonts w:asciiTheme="minorHAnsi" w:hAnsiTheme="minorHAnsi"/>
+              <w:rFonts w:asciiTheme="minorHAnsi" w:eastAsiaTheme="minorEastAsia" w:hAnsiTheme="minorHAnsi" w:cstheme="minorBidi"/>
               <w:noProof/>
-              <w:color w:val="000000" w:themeColor="text1"/>
+              <w:kern w:val="2"/>
+              <w14:ligatures w14:val="standardContextual"/>
             </w:rPr>
           </w:pPr>
-          <w:hyperlink w:anchor="_Toc242260275" w:history="1">
+          <w:hyperlink w:anchor="_Toc242782508" w:history="1">
             <w:r>
               <w:rPr>
                 <w:rStyle w:val="Hyperlink"/>
-                <w:rFonts w:asciiTheme="minorHAnsi" w:hAnsiTheme="minorHAnsi"/>
-                <w:noProof/>
-                <w:color w:val="000000" w:themeColor="text1"/>
+                <w:rFonts w:asciiTheme="majorHAnsi" w:hAnsiTheme="majorHAnsi"/>
+                <w:noProof/>
               </w:rPr>
               <w:t>Before You Begin</w:t>
             </w:r>
             <w:r>
               <w:rPr>
-                <w:rFonts w:asciiTheme="minorHAnsi" w:hAnsiTheme="minorHAnsi"/>
-                <w:noProof/>
-                <w:webHidden/>
-                <w:color w:val="000000" w:themeColor="text1"/>
+                <w:noProof/>
+                <w:webHidden/>
               </w:rPr>
               <w:tab/>
             </w:r>
             <w:r>
               <w:rPr>
-                <w:rFonts w:asciiTheme="minorHAnsi" w:hAnsiTheme="minorHAnsi"/>
-                <w:noProof/>
-                <w:webHidden/>
-                <w:color w:val="000000" w:themeColor="text1"/>
+                <w:noProof/>
+                <w:webHidden/>
               </w:rPr>
               <w:fldChar w:fldCharType="begin"/>
             </w:r>
             <w:r>
               <w:rPr>
-                <w:rFonts w:asciiTheme="minorHAnsi" w:hAnsiTheme="minorHAnsi"/>
-                <w:noProof/>
-                <w:webHidden/>
-                <w:color w:val="000000" w:themeColor="text1"/>
-              </w:rPr>
-              <w:instrText xml:space="preserve"> PAGEREF _Toc242260275 \h </w:instrText>
-            </w:r>
-            <w:r>
-              <w:rPr>
-                <w:rFonts w:asciiTheme="minorHAnsi" w:hAnsiTheme="minorHAnsi"/>
-                <w:noProof/>
-                <w:webHidden/>
-                <w:color w:val="000000" w:themeColor="text1"/>
-              </w:rPr>
-            </w:r>
-            <w:r>
-              <w:rPr>
-                <w:rFonts w:asciiTheme="minorHAnsi" w:hAnsiTheme="minorHAnsi"/>
-                <w:noProof/>
-                <w:webHidden/>
-                <w:color w:val="000000" w:themeColor="text1"/>
+                <w:noProof/>
+                <w:webHidden/>
+              </w:rPr>
+              <w:instrText xml:space="preserve"> PAGEREF _Toc242782508 \h </w:instrText>
+            </w:r>
+            <w:r>
+              <w:rPr>
+                <w:noProof/>
+                <w:webHidden/>
+              </w:rPr>
+            </w:r>
+            <w:r>
+              <w:rPr>
+                <w:noProof/>
+                <w:webHidden/>
               </w:rPr>
               <w:fldChar w:fldCharType="separate"/>
             </w:r>
             <w:r>
               <w:rPr>
-                <w:rFonts w:asciiTheme="minorHAnsi" w:hAnsiTheme="minorHAnsi"/>
-                <w:noProof/>
-                <w:webHidden/>
-                <w:color w:val="000000" w:themeColor="text1"/>
+                <w:noProof/>
+                <w:webHidden/>
               </w:rPr>
               <w:t>3</w:t>
             </w:r>
             <w:r>
               <w:rPr>
-                <w:rFonts w:asciiTheme="minorHAnsi" w:hAnsiTheme="minorHAnsi"/>
-                <w:noProof/>
-                <w:webHidden/>
-                <w:color w:val="000000" w:themeColor="text1"/>
+                <w:noProof/>
+                <w:webHidden/>
               </w:rPr>
               <w:fldChar w:fldCharType="end"/>
             </w:r>
@@ -666,80 +661,66 @@
               <w:tab w:val="right" w:leader="dot" w:pos="9016"/>
             </w:tabs>
             <w:rPr>
-              <w:rFonts w:asciiTheme="minorHAnsi" w:hAnsiTheme="minorHAnsi"/>
+              <w:rFonts w:asciiTheme="minorHAnsi" w:eastAsiaTheme="minorEastAsia" w:hAnsiTheme="minorHAnsi" w:cstheme="minorBidi"/>
               <w:noProof/>
-              <w:color w:val="000000" w:themeColor="text1"/>
+              <w:kern w:val="2"/>
+              <w14:ligatures w14:val="standardContextual"/>
             </w:rPr>
           </w:pPr>
-          <w:hyperlink w:anchor="_Toc242260276" w:history="1">
+          <w:hyperlink w:anchor="_Toc242782509" w:history="1">
             <w:r>
               <w:rPr>
                 <w:rStyle w:val="Hyperlink"/>
-                <w:rFonts w:asciiTheme="minorHAnsi" w:hAnsiTheme="minorHAnsi"/>
-                <w:noProof/>
-                <w:color w:val="000000" w:themeColor="text1"/>
+                <w:rFonts w:asciiTheme="majorHAnsi" w:hAnsiTheme="majorHAnsi"/>
+                <w:noProof/>
               </w:rPr>
               <w:t>Get Started</w:t>
             </w:r>
             <w:r>
               <w:rPr>
-                <w:rFonts w:asciiTheme="minorHAnsi" w:hAnsiTheme="minorHAnsi"/>
-                <w:noProof/>
-                <w:webHidden/>
-                <w:color w:val="000000" w:themeColor="text1"/>
+                <w:noProof/>
+                <w:webHidden/>
               </w:rPr>
               <w:tab/>
             </w:r>
             <w:r>
               <w:rPr>
-                <w:rFonts w:asciiTheme="minorHAnsi" w:hAnsiTheme="minorHAnsi"/>
-                <w:noProof/>
-                <w:webHidden/>
-                <w:color w:val="000000" w:themeColor="text1"/>
+                <w:noProof/>
+                <w:webHidden/>
               </w:rPr>
               <w:fldChar w:fldCharType="begin"/>
             </w:r>
             <w:r>
               <w:rPr>
-                <w:rFonts w:asciiTheme="minorHAnsi" w:hAnsiTheme="minorHAnsi"/>
-                <w:noProof/>
-                <w:webHidden/>
-                <w:color w:val="000000" w:themeColor="text1"/>
-              </w:rPr>
-              <w:instrText xml:space="preserve"> PAGEREF _Toc242260276 \h </w:instrText>
-            </w:r>
-            <w:r>
-              <w:rPr>
-                <w:rFonts w:asciiTheme="minorHAnsi" w:hAnsiTheme="minorHAnsi"/>
-                <w:noProof/>
-                <w:webHidden/>
-                <w:color w:val="000000" w:themeColor="text1"/>
-              </w:rPr>
-            </w:r>
-            <w:r>
-              <w:rPr>
-                <w:rFonts w:asciiTheme="minorHAnsi" w:hAnsiTheme="minorHAnsi"/>
-                <w:noProof/>
-                <w:webHidden/>
-                <w:color w:val="000000" w:themeColor="text1"/>
+                <w:noProof/>
+                <w:webHidden/>
+              </w:rPr>
+              <w:instrText xml:space="preserve"> PAGEREF _Toc242782509 \h </w:instrText>
+            </w:r>
+            <w:r>
+              <w:rPr>
+                <w:noProof/>
+                <w:webHidden/>
+              </w:rPr>
+            </w:r>
+            <w:r>
+              <w:rPr>
+                <w:noProof/>
+                <w:webHidden/>
               </w:rPr>
               <w:fldChar w:fldCharType="separate"/>
             </w:r>
             <w:r>
               <w:rPr>
-                <w:rFonts w:asciiTheme="minorHAnsi" w:hAnsiTheme="minorHAnsi"/>
-                <w:noProof/>
-                <w:webHidden/>
-                <w:color w:val="000000" w:themeColor="text1"/>
-              </w:rPr>
-              <w:t>3</w:t>
-            </w:r>
-            <w:r>
-              <w:rPr>
-                <w:rFonts w:asciiTheme="minorHAnsi" w:hAnsiTheme="minorHAnsi"/>
-                <w:noProof/>
-                <w:webHidden/>
-                <w:color w:val="000000" w:themeColor="text1"/>
+                <w:noProof/>
+                <w:webHidden/>
+              </w:rPr>
+              <w:t>4</w:t>
+            </w:r>
+            <w:r>
+              <w:rPr>
+                <w:noProof/>
+                <w:webHidden/>
               </w:rPr>
               <w:fldChar w:fldCharType="end"/>
             </w:r>
@@ -752,80 +733,66 @@
               <w:tab w:val="right" w:leader="dot" w:pos="9016"/>
             </w:tabs>
             <w:rPr>
-              <w:rFonts w:asciiTheme="minorHAnsi" w:hAnsiTheme="minorHAnsi"/>
+              <w:rFonts w:asciiTheme="minorHAnsi" w:eastAsiaTheme="minorEastAsia" w:hAnsiTheme="minorHAnsi" w:cstheme="minorBidi"/>
               <w:noProof/>
-              <w:color w:val="000000" w:themeColor="text1"/>
+              <w:kern w:val="2"/>
+              <w14:ligatures w14:val="standardContextual"/>
             </w:rPr>
           </w:pPr>
-          <w:hyperlink w:anchor="_Toc242260277" w:history="1">
+          <w:hyperlink w:anchor="_Toc242782510" w:history="1">
             <w:r>
               <w:rPr>
                 <w:rStyle w:val="Hyperlink"/>
-                <w:rFonts w:asciiTheme="minorHAnsi" w:hAnsiTheme="minorHAnsi"/>
-                <w:noProof/>
-                <w:color w:val="000000" w:themeColor="text1"/>
+                <w:rFonts w:asciiTheme="majorHAnsi" w:hAnsiTheme="majorHAnsi"/>
+                <w:noProof/>
               </w:rPr>
               <w:t>1. Create a PAX Fabric Pipeline Item</w:t>
             </w:r>
             <w:r>
               <w:rPr>
-                <w:rFonts w:asciiTheme="minorHAnsi" w:hAnsiTheme="minorHAnsi"/>
-                <w:noProof/>
-                <w:webHidden/>
-                <w:color w:val="000000" w:themeColor="text1"/>
+                <w:noProof/>
+                <w:webHidden/>
               </w:rPr>
               <w:tab/>
             </w:r>
             <w:r>
               <w:rPr>
-                <w:rFonts w:asciiTheme="minorHAnsi" w:hAnsiTheme="minorHAnsi"/>
-                <w:noProof/>
-                <w:webHidden/>
-                <w:color w:val="000000" w:themeColor="text1"/>
+                <w:noProof/>
+                <w:webHidden/>
               </w:rPr>
               <w:fldChar w:fldCharType="begin"/>
             </w:r>
             <w:r>
               <w:rPr>
-                <w:rFonts w:asciiTheme="minorHAnsi" w:hAnsiTheme="minorHAnsi"/>
-                <w:noProof/>
-                <w:webHidden/>
-                <w:color w:val="000000" w:themeColor="text1"/>
-              </w:rPr>
-              <w:instrText xml:space="preserve"> PAGEREF _Toc242260277 \h </w:instrText>
-            </w:r>
-            <w:r>
-              <w:rPr>
-                <w:rFonts w:asciiTheme="minorHAnsi" w:hAnsiTheme="minorHAnsi"/>
-                <w:noProof/>
-                <w:webHidden/>
-                <w:color w:val="000000" w:themeColor="text1"/>
-              </w:rPr>
-            </w:r>
-            <w:r>
-              <w:rPr>
-                <w:rFonts w:asciiTheme="minorHAnsi" w:hAnsiTheme="minorHAnsi"/>
-                <w:noProof/>
-                <w:webHidden/>
-                <w:color w:val="000000" w:themeColor="text1"/>
+                <w:noProof/>
+                <w:webHidden/>
+              </w:rPr>
+              <w:instrText xml:space="preserve"> PAGEREF _Toc242782510 \h </w:instrText>
+            </w:r>
+            <w:r>
+              <w:rPr>
+                <w:noProof/>
+                <w:webHidden/>
+              </w:rPr>
+            </w:r>
+            <w:r>
+              <w:rPr>
+                <w:noProof/>
+                <w:webHidden/>
               </w:rPr>
               <w:fldChar w:fldCharType="separate"/>
             </w:r>
             <w:r>
               <w:rPr>
-                <w:rFonts w:asciiTheme="minorHAnsi" w:hAnsiTheme="minorHAnsi"/>
-                <w:noProof/>
-                <w:webHidden/>
-                <w:color w:val="000000" w:themeColor="text1"/>
-              </w:rPr>
-              <w:t>3</w:t>
-            </w:r>
-            <w:r>
-              <w:rPr>
-                <w:rFonts w:asciiTheme="minorHAnsi" w:hAnsiTheme="minorHAnsi"/>
-                <w:noProof/>
-                <w:webHidden/>
-                <w:color w:val="000000" w:themeColor="text1"/>
+                <w:noProof/>
+                <w:webHidden/>
+              </w:rPr>
+              <w:t>4</w:t>
+            </w:r>
+            <w:r>
+              <w:rPr>
+                <w:noProof/>
+                <w:webHidden/>
               </w:rPr>
               <w:fldChar w:fldCharType="end"/>
             </w:r>
@@ -838,80 +805,66 @@
               <w:tab w:val="right" w:leader="dot" w:pos="9016"/>
             </w:tabs>
             <w:rPr>
-              <w:rFonts w:asciiTheme="minorHAnsi" w:hAnsiTheme="minorHAnsi"/>
+              <w:rFonts w:asciiTheme="minorHAnsi" w:eastAsiaTheme="minorEastAsia" w:hAnsiTheme="minorHAnsi" w:cstheme="minorBidi"/>
               <w:noProof/>
-              <w:color w:val="000000" w:themeColor="text1"/>
+              <w:kern w:val="2"/>
+              <w14:ligatures w14:val="standardContextual"/>
             </w:rPr>
           </w:pPr>
-          <w:hyperlink w:anchor="_Toc242260278" w:history="1">
+          <w:hyperlink w:anchor="_Toc242782511" w:history="1">
             <w:r>
               <w:rPr>
                 <w:rStyle w:val="Hyperlink"/>
-                <w:rFonts w:asciiTheme="minorHAnsi" w:hAnsiTheme="minorHAnsi"/>
-                <w:noProof/>
-                <w:color w:val="000000" w:themeColor="text1"/>
+                <w:rFonts w:asciiTheme="majorHAnsi" w:hAnsiTheme="majorHAnsi"/>
+                <w:noProof/>
               </w:rPr>
               <w:t>2. Deploy the Fabric Resources</w:t>
             </w:r>
             <w:r>
               <w:rPr>
-                <w:rFonts w:asciiTheme="minorHAnsi" w:hAnsiTheme="minorHAnsi"/>
-                <w:noProof/>
-                <w:webHidden/>
-                <w:color w:val="000000" w:themeColor="text1"/>
+                <w:noProof/>
+                <w:webHidden/>
               </w:rPr>
               <w:tab/>
             </w:r>
             <w:r>
               <w:rPr>
-                <w:rFonts w:asciiTheme="minorHAnsi" w:hAnsiTheme="minorHAnsi"/>
-                <w:noProof/>
-                <w:webHidden/>
-                <w:color w:val="000000" w:themeColor="text1"/>
+                <w:noProof/>
+                <w:webHidden/>
               </w:rPr>
               <w:fldChar w:fldCharType="begin"/>
             </w:r>
             <w:r>
               <w:rPr>
-                <w:rFonts w:asciiTheme="minorHAnsi" w:hAnsiTheme="minorHAnsi"/>
-                <w:noProof/>
-                <w:webHidden/>
-                <w:color w:val="000000" w:themeColor="text1"/>
-              </w:rPr>
-              <w:instrText xml:space="preserve"> PAGEREF _Toc242260278 \h </w:instrText>
-            </w:r>
-            <w:r>
-              <w:rPr>
-                <w:rFonts w:asciiTheme="minorHAnsi" w:hAnsiTheme="minorHAnsi"/>
-                <w:noProof/>
-                <w:webHidden/>
-                <w:color w:val="000000" w:themeColor="text1"/>
-              </w:rPr>
-            </w:r>
-            <w:r>
-              <w:rPr>
-                <w:rFonts w:asciiTheme="minorHAnsi" w:hAnsiTheme="minorHAnsi"/>
-                <w:noProof/>
-                <w:webHidden/>
-                <w:color w:val="000000" w:themeColor="text1"/>
+                <w:noProof/>
+                <w:webHidden/>
+              </w:rPr>
+              <w:instrText xml:space="preserve"> PAGEREF _Toc242782511 \h </w:instrText>
+            </w:r>
+            <w:r>
+              <w:rPr>
+                <w:noProof/>
+                <w:webHidden/>
+              </w:rPr>
+            </w:r>
+            <w:r>
+              <w:rPr>
+                <w:noProof/>
+                <w:webHidden/>
               </w:rPr>
               <w:fldChar w:fldCharType="separate"/>
             </w:r>
             <w:r>
               <w:rPr>
-                <w:rFonts w:asciiTheme="minorHAnsi" w:hAnsiTheme="minorHAnsi"/>
-                <w:noProof/>
-                <w:webHidden/>
-                <w:color w:val="000000" w:themeColor="text1"/>
-              </w:rPr>
-              <w:t>4</w:t>
-            </w:r>
-            <w:r>
-              <w:rPr>
-                <w:rFonts w:asciiTheme="minorHAnsi" w:hAnsiTheme="minorHAnsi"/>
-                <w:noProof/>
-                <w:webHidden/>
-                <w:color w:val="000000" w:themeColor="text1"/>
+                <w:noProof/>
+                <w:webHidden/>
+              </w:rPr>
+              <w:t>5</w:t>
+            </w:r>
+            <w:r>
+              <w:rPr>
+                <w:noProof/>
+                <w:webHidden/>
               </w:rPr>
               <w:fldChar w:fldCharType="end"/>
             </w:r>
@@ -924,80 +877,66 @@
               <w:tab w:val="right" w:leader="dot" w:pos="9016"/>
             </w:tabs>
             <w:rPr>
-              <w:rFonts w:asciiTheme="minorHAnsi" w:hAnsiTheme="minorHAnsi"/>
+              <w:rFonts w:asciiTheme="minorHAnsi" w:eastAsiaTheme="minorEastAsia" w:hAnsiTheme="minorHAnsi" w:cstheme="minorBidi"/>
               <w:noProof/>
-              <w:color w:val="000000" w:themeColor="text1"/>
+              <w:kern w:val="2"/>
+              <w14:ligatures w14:val="standardContextual"/>
             </w:rPr>
           </w:pPr>
-          <w:hyperlink w:anchor="_Toc242260279" w:history="1">
+          <w:hyperlink w:anchor="_Toc242782512" w:history="1">
             <w:r>
               <w:rPr>
                 <w:rStyle w:val="Hyperlink"/>
-                <w:rFonts w:asciiTheme="minorHAnsi" w:hAnsiTheme="minorHAnsi"/>
-                <w:noProof/>
-                <w:color w:val="000000" w:themeColor="text1"/>
+                <w:rFonts w:asciiTheme="majorHAnsi" w:hAnsiTheme="majorHAnsi"/>
+                <w:noProof/>
               </w:rPr>
               <w:t>3. Configure the Workload</w:t>
             </w:r>
             <w:r>
               <w:rPr>
-                <w:rFonts w:asciiTheme="minorHAnsi" w:hAnsiTheme="minorHAnsi"/>
-                <w:noProof/>
-                <w:webHidden/>
-                <w:color w:val="000000" w:themeColor="text1"/>
+                <w:noProof/>
+                <w:webHidden/>
               </w:rPr>
               <w:tab/>
             </w:r>
             <w:r>
               <w:rPr>
-                <w:rFonts w:asciiTheme="minorHAnsi" w:hAnsiTheme="minorHAnsi"/>
-                <w:noProof/>
-                <w:webHidden/>
-                <w:color w:val="000000" w:themeColor="text1"/>
+                <w:noProof/>
+                <w:webHidden/>
               </w:rPr>
               <w:fldChar w:fldCharType="begin"/>
             </w:r>
             <w:r>
               <w:rPr>
-                <w:rFonts w:asciiTheme="minorHAnsi" w:hAnsiTheme="minorHAnsi"/>
-                <w:noProof/>
-                <w:webHidden/>
-                <w:color w:val="000000" w:themeColor="text1"/>
-              </w:rPr>
-              <w:instrText xml:space="preserve"> PAGEREF _Toc242260279 \h </w:instrText>
-            </w:r>
-            <w:r>
-              <w:rPr>
-                <w:rFonts w:asciiTheme="minorHAnsi" w:hAnsiTheme="minorHAnsi"/>
-                <w:noProof/>
-                <w:webHidden/>
-                <w:color w:val="000000" w:themeColor="text1"/>
-              </w:rPr>
-            </w:r>
-            <w:r>
-              <w:rPr>
-                <w:rFonts w:asciiTheme="minorHAnsi" w:hAnsiTheme="minorHAnsi"/>
-                <w:noProof/>
-                <w:webHidden/>
-                <w:color w:val="000000" w:themeColor="text1"/>
+                <w:noProof/>
+                <w:webHidden/>
+              </w:rPr>
+              <w:instrText xml:space="preserve"> PAGEREF _Toc242782512 \h </w:instrText>
+            </w:r>
+            <w:r>
+              <w:rPr>
+                <w:noProof/>
+                <w:webHidden/>
+              </w:rPr>
+            </w:r>
+            <w:r>
+              <w:rPr>
+                <w:noProof/>
+                <w:webHidden/>
               </w:rPr>
               <w:fldChar w:fldCharType="separate"/>
             </w:r>
             <w:r>
               <w:rPr>
-                <w:rFonts w:asciiTheme="minorHAnsi" w:hAnsiTheme="minorHAnsi"/>
-                <w:noProof/>
-                <w:webHidden/>
-                <w:color w:val="000000" w:themeColor="text1"/>
-              </w:rPr>
-              <w:t>4</w:t>
-            </w:r>
-            <w:r>
-              <w:rPr>
-                <w:rFonts w:asciiTheme="minorHAnsi" w:hAnsiTheme="minorHAnsi"/>
-                <w:noProof/>
-                <w:webHidden/>
-                <w:color w:val="000000" w:themeColor="text1"/>
+                <w:noProof/>
+                <w:webHidden/>
+              </w:rPr>
+              <w:t>5</w:t>
+            </w:r>
+            <w:r>
+              <w:rPr>
+                <w:noProof/>
+                <w:webHidden/>
               </w:rPr>
               <w:fldChar w:fldCharType="end"/>
             </w:r>
@@ -1010,80 +949,66 @@
               <w:tab w:val="right" w:leader="dot" w:pos="9016"/>
             </w:tabs>
             <w:rPr>
-              <w:rFonts w:asciiTheme="minorHAnsi" w:hAnsiTheme="minorHAnsi"/>
+              <w:rFonts w:asciiTheme="minorHAnsi" w:eastAsiaTheme="minorEastAsia" w:hAnsiTheme="minorHAnsi" w:cstheme="minorBidi"/>
               <w:noProof/>
-              <w:color w:val="000000" w:themeColor="text1"/>
+              <w:kern w:val="2"/>
+              <w14:ligatures w14:val="standardContextual"/>
             </w:rPr>
           </w:pPr>
-          <w:hyperlink w:anchor="_Toc242260280" w:history="1">
+          <w:hyperlink w:anchor="_Toc242782513" w:history="1">
             <w:r>
               <w:rPr>
                 <w:rStyle w:val="Hyperlink"/>
-                <w:rFonts w:asciiTheme="minorHAnsi" w:hAnsiTheme="minorHAnsi"/>
-                <w:noProof/>
-                <w:color w:val="000000" w:themeColor="text1"/>
+                <w:rFonts w:asciiTheme="majorHAnsi" w:hAnsiTheme="majorHAnsi"/>
+                <w:noProof/>
               </w:rPr>
               <w:t>Understanding PAX Configuration</w:t>
             </w:r>
             <w:r>
               <w:rPr>
-                <w:rFonts w:asciiTheme="minorHAnsi" w:hAnsiTheme="minorHAnsi"/>
-                <w:noProof/>
-                <w:webHidden/>
-                <w:color w:val="000000" w:themeColor="text1"/>
+                <w:noProof/>
+                <w:webHidden/>
               </w:rPr>
               <w:tab/>
             </w:r>
             <w:r>
               <w:rPr>
-                <w:rFonts w:asciiTheme="minorHAnsi" w:hAnsiTheme="minorHAnsi"/>
-                <w:noProof/>
-                <w:webHidden/>
-                <w:color w:val="000000" w:themeColor="text1"/>
+                <w:noProof/>
+                <w:webHidden/>
               </w:rPr>
               <w:fldChar w:fldCharType="begin"/>
             </w:r>
             <w:r>
               <w:rPr>
-                <w:rFonts w:asciiTheme="minorHAnsi" w:hAnsiTheme="minorHAnsi"/>
-                <w:noProof/>
-                <w:webHidden/>
-                <w:color w:val="000000" w:themeColor="text1"/>
-              </w:rPr>
-              <w:instrText xml:space="preserve"> PAGEREF _Toc242260280 \h </w:instrText>
-            </w:r>
-            <w:r>
-              <w:rPr>
-                <w:rFonts w:asciiTheme="minorHAnsi" w:hAnsiTheme="minorHAnsi"/>
-                <w:noProof/>
-                <w:webHidden/>
-                <w:color w:val="000000" w:themeColor="text1"/>
-              </w:rPr>
-            </w:r>
-            <w:r>
-              <w:rPr>
-                <w:rFonts w:asciiTheme="minorHAnsi" w:hAnsiTheme="minorHAnsi"/>
-                <w:noProof/>
-                <w:webHidden/>
-                <w:color w:val="000000" w:themeColor="text1"/>
+                <w:noProof/>
+                <w:webHidden/>
+              </w:rPr>
+              <w:instrText xml:space="preserve"> PAGEREF _Toc242782513 \h </w:instrText>
+            </w:r>
+            <w:r>
+              <w:rPr>
+                <w:noProof/>
+                <w:webHidden/>
+              </w:rPr>
+            </w:r>
+            <w:r>
+              <w:rPr>
+                <w:noProof/>
+                <w:webHidden/>
               </w:rPr>
               <w:fldChar w:fldCharType="separate"/>
             </w:r>
             <w:r>
               <w:rPr>
-                <w:rFonts w:asciiTheme="minorHAnsi" w:hAnsiTheme="minorHAnsi"/>
-                <w:noProof/>
-                <w:webHidden/>
-                <w:color w:val="000000" w:themeColor="text1"/>
-              </w:rPr>
-              <w:t>5</w:t>
-            </w:r>
-            <w:r>
-              <w:rPr>
-                <w:rFonts w:asciiTheme="minorHAnsi" w:hAnsiTheme="minorHAnsi"/>
-                <w:noProof/>
-                <w:webHidden/>
-                <w:color w:val="000000" w:themeColor="text1"/>
+                <w:noProof/>
+                <w:webHidden/>
+              </w:rPr>
+              <w:t>6</w:t>
+            </w:r>
+            <w:r>
+              <w:rPr>
+                <w:noProof/>
+                <w:webHidden/>
               </w:rPr>
               <w:fldChar w:fldCharType="end"/>
             </w:r>
@@ -1096,80 +1021,66 @@
               <w:tab w:val="right" w:leader="dot" w:pos="9016"/>
             </w:tabs>
             <w:rPr>
-              <w:rFonts w:asciiTheme="minorHAnsi" w:hAnsiTheme="minorHAnsi"/>
+              <w:rFonts w:asciiTheme="minorHAnsi" w:eastAsiaTheme="minorEastAsia" w:hAnsiTheme="minorHAnsi" w:cstheme="minorBidi"/>
               <w:noProof/>
-              <w:color w:val="000000" w:themeColor="text1"/>
+              <w:kern w:val="2"/>
+              <w14:ligatures w14:val="standardContextual"/>
             </w:rPr>
           </w:pPr>
-          <w:hyperlink w:anchor="_Toc242260281" w:history="1">
+          <w:hyperlink w:anchor="_Toc242782514" w:history="1">
             <w:r>
               <w:rPr>
                 <w:rStyle w:val="Hyperlink"/>
-                <w:rFonts w:asciiTheme="minorHAnsi" w:hAnsiTheme="minorHAnsi"/>
-                <w:noProof/>
-                <w:color w:val="000000" w:themeColor="text1"/>
+                <w:rFonts w:asciiTheme="majorHAnsi" w:hAnsiTheme="majorHAnsi"/>
+                <w:noProof/>
               </w:rPr>
               <w:t>Run the Pipeline</w:t>
             </w:r>
             <w:r>
               <w:rPr>
-                <w:rFonts w:asciiTheme="minorHAnsi" w:hAnsiTheme="minorHAnsi"/>
-                <w:noProof/>
-                <w:webHidden/>
-                <w:color w:val="000000" w:themeColor="text1"/>
+                <w:noProof/>
+                <w:webHidden/>
               </w:rPr>
               <w:tab/>
             </w:r>
             <w:r>
               <w:rPr>
-                <w:rFonts w:asciiTheme="minorHAnsi" w:hAnsiTheme="minorHAnsi"/>
-                <w:noProof/>
-                <w:webHidden/>
-                <w:color w:val="000000" w:themeColor="text1"/>
+                <w:noProof/>
+                <w:webHidden/>
               </w:rPr>
               <w:fldChar w:fldCharType="begin"/>
             </w:r>
             <w:r>
               <w:rPr>
-                <w:rFonts w:asciiTheme="minorHAnsi" w:hAnsiTheme="minorHAnsi"/>
-                <w:noProof/>
-                <w:webHidden/>
-                <w:color w:val="000000" w:themeColor="text1"/>
-              </w:rPr>
-              <w:instrText xml:space="preserve"> PAGEREF _Toc242260281 \h </w:instrText>
-            </w:r>
-            <w:r>
-              <w:rPr>
-                <w:rFonts w:asciiTheme="minorHAnsi" w:hAnsiTheme="minorHAnsi"/>
-                <w:noProof/>
-                <w:webHidden/>
-                <w:color w:val="000000" w:themeColor="text1"/>
-              </w:rPr>
-            </w:r>
-            <w:r>
-              <w:rPr>
-                <w:rFonts w:asciiTheme="minorHAnsi" w:hAnsiTheme="minorHAnsi"/>
-                <w:noProof/>
-                <w:webHidden/>
-                <w:color w:val="000000" w:themeColor="text1"/>
+                <w:noProof/>
+                <w:webHidden/>
+              </w:rPr>
+              <w:instrText xml:space="preserve"> PAGEREF _Toc242782514 \h </w:instrText>
+            </w:r>
+            <w:r>
+              <w:rPr>
+                <w:noProof/>
+                <w:webHidden/>
+              </w:rPr>
+            </w:r>
+            <w:r>
+              <w:rPr>
+                <w:noProof/>
+                <w:webHidden/>
               </w:rPr>
               <w:fldChar w:fldCharType="separate"/>
             </w:r>
             <w:r>
               <w:rPr>
-                <w:rFonts w:asciiTheme="minorHAnsi" w:hAnsiTheme="minorHAnsi"/>
-                <w:noProof/>
-                <w:webHidden/>
-                <w:color w:val="000000" w:themeColor="text1"/>
-              </w:rPr>
-              <w:t>5</w:t>
-            </w:r>
-            <w:r>
-              <w:rPr>
-                <w:rFonts w:asciiTheme="minorHAnsi" w:hAnsiTheme="minorHAnsi"/>
-                <w:noProof/>
-                <w:webHidden/>
-                <w:color w:val="000000" w:themeColor="text1"/>
+                <w:noProof/>
+                <w:webHidden/>
+              </w:rPr>
+              <w:t>6</w:t>
+            </w:r>
+            <w:r>
+              <w:rPr>
+                <w:noProof/>
+                <w:webHidden/>
               </w:rPr>
               <w:fldChar w:fldCharType="end"/>
             </w:r>
@@ -1182,80 +1093,66 @@
               <w:tab w:val="right" w:leader="dot" w:pos="9016"/>
             </w:tabs>
             <w:rPr>
-              <w:rFonts w:asciiTheme="minorHAnsi" w:hAnsiTheme="minorHAnsi"/>
+              <w:rFonts w:asciiTheme="minorHAnsi" w:eastAsiaTheme="minorEastAsia" w:hAnsiTheme="minorHAnsi" w:cstheme="minorBidi"/>
               <w:noProof/>
-              <w:color w:val="000000" w:themeColor="text1"/>
+              <w:kern w:val="2"/>
+              <w14:ligatures w14:val="standardContextual"/>
             </w:rPr>
           </w:pPr>
-          <w:hyperlink w:anchor="_Toc242260282" w:history="1">
+          <w:hyperlink w:anchor="_Toc242782515" w:history="1">
             <w:r>
               <w:rPr>
                 <w:rStyle w:val="Hyperlink"/>
-                <w:rFonts w:asciiTheme="minorHAnsi" w:hAnsiTheme="minorHAnsi"/>
-                <w:noProof/>
-                <w:color w:val="000000" w:themeColor="text1"/>
+                <w:rFonts w:asciiTheme="majorHAnsi" w:hAnsiTheme="majorHAnsi"/>
+                <w:noProof/>
               </w:rPr>
               <w:t>Create Recurring Schedules</w:t>
             </w:r>
             <w:r>
               <w:rPr>
-                <w:rFonts w:asciiTheme="minorHAnsi" w:hAnsiTheme="minorHAnsi"/>
-                <w:noProof/>
-                <w:webHidden/>
-                <w:color w:val="000000" w:themeColor="text1"/>
+                <w:noProof/>
+                <w:webHidden/>
               </w:rPr>
               <w:tab/>
             </w:r>
             <w:r>
               <w:rPr>
-                <w:rFonts w:asciiTheme="minorHAnsi" w:hAnsiTheme="minorHAnsi"/>
-                <w:noProof/>
-                <w:webHidden/>
-                <w:color w:val="000000" w:themeColor="text1"/>
+                <w:noProof/>
+                <w:webHidden/>
               </w:rPr>
               <w:fldChar w:fldCharType="begin"/>
             </w:r>
             <w:r>
               <w:rPr>
-                <w:rFonts w:asciiTheme="minorHAnsi" w:hAnsiTheme="minorHAnsi"/>
-                <w:noProof/>
-                <w:webHidden/>
-                <w:color w:val="000000" w:themeColor="text1"/>
-              </w:rPr>
-              <w:instrText xml:space="preserve"> PAGEREF _Toc242260282 \h </w:instrText>
-            </w:r>
-            <w:r>
-              <w:rPr>
-                <w:rFonts w:asciiTheme="minorHAnsi" w:hAnsiTheme="minorHAnsi"/>
-                <w:noProof/>
-                <w:webHidden/>
-                <w:color w:val="000000" w:themeColor="text1"/>
-              </w:rPr>
-            </w:r>
-            <w:r>
-              <w:rPr>
-                <w:rFonts w:asciiTheme="minorHAnsi" w:hAnsiTheme="minorHAnsi"/>
-                <w:noProof/>
-                <w:webHidden/>
-                <w:color w:val="000000" w:themeColor="text1"/>
+                <w:noProof/>
+                <w:webHidden/>
+              </w:rPr>
+              <w:instrText xml:space="preserve"> PAGEREF _Toc242782515 \h </w:instrText>
+            </w:r>
+            <w:r>
+              <w:rPr>
+                <w:noProof/>
+                <w:webHidden/>
+              </w:rPr>
+            </w:r>
+            <w:r>
+              <w:rPr>
+                <w:noProof/>
+                <w:webHidden/>
               </w:rPr>
               <w:fldChar w:fldCharType="separate"/>
             </w:r>
             <w:r>
               <w:rPr>
-                <w:rFonts w:asciiTheme="minorHAnsi" w:hAnsiTheme="minorHAnsi"/>
-                <w:noProof/>
-                <w:webHidden/>
-                <w:color w:val="000000" w:themeColor="text1"/>
-              </w:rPr>
-              <w:t>6</w:t>
-            </w:r>
-            <w:r>
-              <w:rPr>
-                <w:rFonts w:asciiTheme="minorHAnsi" w:hAnsiTheme="minorHAnsi"/>
-                <w:noProof/>
-                <w:webHidden/>
-                <w:color w:val="000000" w:themeColor="text1"/>
+                <w:noProof/>
+                <w:webHidden/>
+              </w:rPr>
+              <w:t>7</w:t>
+            </w:r>
+            <w:r>
+              <w:rPr>
+                <w:noProof/>
+                <w:webHidden/>
               </w:rPr>
               <w:fldChar w:fldCharType="end"/>
             </w:r>
@@ -1268,80 +1165,66 @@
               <w:tab w:val="right" w:leader="dot" w:pos="9016"/>
             </w:tabs>
             <w:rPr>
-              <w:rFonts w:asciiTheme="minorHAnsi" w:hAnsiTheme="minorHAnsi"/>
+              <w:rFonts w:asciiTheme="minorHAnsi" w:eastAsiaTheme="minorEastAsia" w:hAnsiTheme="minorHAnsi" w:cstheme="minorBidi"/>
               <w:noProof/>
-              <w:color w:val="000000" w:themeColor="text1"/>
+              <w:kern w:val="2"/>
+              <w14:ligatures w14:val="standardContextual"/>
             </w:rPr>
           </w:pPr>
-          <w:hyperlink w:anchor="_Toc242260283" w:history="1">
+          <w:hyperlink w:anchor="_Toc242782516" w:history="1">
             <w:r>
               <w:rPr>
                 <w:rStyle w:val="Hyperlink"/>
-                <w:rFonts w:asciiTheme="minorHAnsi" w:hAnsiTheme="minorHAnsi"/>
-                <w:noProof/>
-                <w:color w:val="000000" w:themeColor="text1"/>
+                <w:rFonts w:asciiTheme="majorHAnsi" w:hAnsiTheme="majorHAnsi"/>
+                <w:noProof/>
               </w:rPr>
               <w:t>Monitor Runs</w:t>
             </w:r>
             <w:r>
               <w:rPr>
-                <w:rFonts w:asciiTheme="minorHAnsi" w:hAnsiTheme="minorHAnsi"/>
-                <w:noProof/>
-                <w:webHidden/>
-                <w:color w:val="000000" w:themeColor="text1"/>
+                <w:noProof/>
+                <w:webHidden/>
               </w:rPr>
               <w:tab/>
             </w:r>
             <w:r>
               <w:rPr>
-                <w:rFonts w:asciiTheme="minorHAnsi" w:hAnsiTheme="minorHAnsi"/>
-                <w:noProof/>
-                <w:webHidden/>
-                <w:color w:val="000000" w:themeColor="text1"/>
+                <w:noProof/>
+                <w:webHidden/>
               </w:rPr>
               <w:fldChar w:fldCharType="begin"/>
             </w:r>
             <w:r>
               <w:rPr>
-                <w:rFonts w:asciiTheme="minorHAnsi" w:hAnsiTheme="minorHAnsi"/>
-                <w:noProof/>
-                <w:webHidden/>
-                <w:color w:val="000000" w:themeColor="text1"/>
-              </w:rPr>
-              <w:instrText xml:space="preserve"> PAGEREF _Toc242260283 \h </w:instrText>
-            </w:r>
-            <w:r>
-              <w:rPr>
-                <w:rFonts w:asciiTheme="minorHAnsi" w:hAnsiTheme="minorHAnsi"/>
-                <w:noProof/>
-                <w:webHidden/>
-                <w:color w:val="000000" w:themeColor="text1"/>
-              </w:rPr>
-            </w:r>
-            <w:r>
-              <w:rPr>
-                <w:rFonts w:asciiTheme="minorHAnsi" w:hAnsiTheme="minorHAnsi"/>
-                <w:noProof/>
-                <w:webHidden/>
-                <w:color w:val="000000" w:themeColor="text1"/>
+                <w:noProof/>
+                <w:webHidden/>
+              </w:rPr>
+              <w:instrText xml:space="preserve"> PAGEREF _Toc242782516 \h </w:instrText>
+            </w:r>
+            <w:r>
+              <w:rPr>
+                <w:noProof/>
+                <w:webHidden/>
+              </w:rPr>
+            </w:r>
+            <w:r>
+              <w:rPr>
+                <w:noProof/>
+                <w:webHidden/>
               </w:rPr>
               <w:fldChar w:fldCharType="separate"/>
             </w:r>
             <w:r>
               <w:rPr>
-                <w:rFonts w:asciiTheme="minorHAnsi" w:hAnsiTheme="minorHAnsi"/>
-                <w:noProof/>
-                <w:webHidden/>
-                <w:color w:val="000000" w:themeColor="text1"/>
-              </w:rPr>
-              <w:t>6</w:t>
-            </w:r>
-            <w:r>
-              <w:rPr>
-                <w:rFonts w:asciiTheme="minorHAnsi" w:hAnsiTheme="minorHAnsi"/>
-                <w:noProof/>
-                <w:webHidden/>
-                <w:color w:val="000000" w:themeColor="text1"/>
+                <w:noProof/>
+                <w:webHidden/>
+              </w:rPr>
+              <w:t>8</w:t>
+            </w:r>
+            <w:r>
+              <w:rPr>
+                <w:noProof/>
+                <w:webHidden/>
               </w:rPr>
               <w:fldChar w:fldCharType="end"/>
             </w:r>
@@ -1354,80 +1237,66 @@
               <w:tab w:val="right" w:leader="dot" w:pos="9016"/>
             </w:tabs>
             <w:rPr>
-              <w:rFonts w:asciiTheme="minorHAnsi" w:hAnsiTheme="minorHAnsi"/>
+              <w:rFonts w:asciiTheme="minorHAnsi" w:eastAsiaTheme="minorEastAsia" w:hAnsiTheme="minorHAnsi" w:cstheme="minorBidi"/>
               <w:noProof/>
-              <w:color w:val="000000" w:themeColor="text1"/>
+              <w:kern w:val="2"/>
+              <w14:ligatures w14:val="standardContextual"/>
             </w:rPr>
           </w:pPr>
-          <w:hyperlink w:anchor="_Toc242260284" w:history="1">
+          <w:hyperlink w:anchor="_Toc242782517" w:history="1">
             <w:r>
               <w:rPr>
                 <w:rStyle w:val="Hyperlink"/>
-                <w:rFonts w:asciiTheme="minorHAnsi" w:hAnsiTheme="minorHAnsi"/>
-                <w:noProof/>
-                <w:color w:val="000000" w:themeColor="text1"/>
+                <w:rFonts w:asciiTheme="majorHAnsi" w:hAnsiTheme="majorHAnsi"/>
+                <w:noProof/>
               </w:rPr>
               <w:t>Update Resource Definitions</w:t>
             </w:r>
             <w:r>
               <w:rPr>
-                <w:rFonts w:asciiTheme="minorHAnsi" w:hAnsiTheme="minorHAnsi"/>
-                <w:noProof/>
-                <w:webHidden/>
-                <w:color w:val="000000" w:themeColor="text1"/>
+                <w:noProof/>
+                <w:webHidden/>
               </w:rPr>
               <w:tab/>
             </w:r>
             <w:r>
               <w:rPr>
-                <w:rFonts w:asciiTheme="minorHAnsi" w:hAnsiTheme="minorHAnsi"/>
-                <w:noProof/>
-                <w:webHidden/>
-                <w:color w:val="000000" w:themeColor="text1"/>
+                <w:noProof/>
+                <w:webHidden/>
               </w:rPr>
               <w:fldChar w:fldCharType="begin"/>
             </w:r>
             <w:r>
               <w:rPr>
-                <w:rFonts w:asciiTheme="minorHAnsi" w:hAnsiTheme="minorHAnsi"/>
-                <w:noProof/>
-                <w:webHidden/>
-                <w:color w:val="000000" w:themeColor="text1"/>
-              </w:rPr>
-              <w:instrText xml:space="preserve"> PAGEREF _Toc242260284 \h </w:instrText>
-            </w:r>
-            <w:r>
-              <w:rPr>
-                <w:rFonts w:asciiTheme="minorHAnsi" w:hAnsiTheme="minorHAnsi"/>
-                <w:noProof/>
-                <w:webHidden/>
-                <w:color w:val="000000" w:themeColor="text1"/>
-              </w:rPr>
-            </w:r>
-            <w:r>
-              <w:rPr>
-                <w:rFonts w:asciiTheme="minorHAnsi" w:hAnsiTheme="minorHAnsi"/>
-                <w:noProof/>
-                <w:webHidden/>
-                <w:color w:val="000000" w:themeColor="text1"/>
+                <w:noProof/>
+                <w:webHidden/>
+              </w:rPr>
+              <w:instrText xml:space="preserve"> PAGEREF _Toc242782517 \h </w:instrText>
+            </w:r>
+            <w:r>
+              <w:rPr>
+                <w:noProof/>
+                <w:webHidden/>
+              </w:rPr>
+            </w:r>
+            <w:r>
+              <w:rPr>
+                <w:noProof/>
+                <w:webHidden/>
               </w:rPr>
               <w:fldChar w:fldCharType="separate"/>
             </w:r>
             <w:r>
               <w:rPr>
-                <w:rFonts w:asciiTheme="minorHAnsi" w:hAnsiTheme="minorHAnsi"/>
-                <w:noProof/>
-                <w:webHidden/>
-                <w:color w:val="000000" w:themeColor="text1"/>
-              </w:rPr>
-              <w:t>7</w:t>
-            </w:r>
-            <w:r>
-              <w:rPr>
-                <w:rFonts w:asciiTheme="minorHAnsi" w:hAnsiTheme="minorHAnsi"/>
-                <w:noProof/>
-                <w:webHidden/>
-                <w:color w:val="000000" w:themeColor="text1"/>
+                <w:noProof/>
+                <w:webHidden/>
+              </w:rPr>
+              <w:t>8</w:t>
+            </w:r>
+            <w:r>
+              <w:rPr>
+                <w:noProof/>
+                <w:webHidden/>
               </w:rPr>
               <w:fldChar w:fldCharType="end"/>
             </w:r>
@@ -1440,80 +1309,66 @@
               <w:tab w:val="right" w:leader="dot" w:pos="9016"/>
             </w:tabs>
             <w:rPr>
-              <w:rFonts w:asciiTheme="minorHAnsi" w:hAnsiTheme="minorHAnsi"/>
+              <w:rFonts w:asciiTheme="minorHAnsi" w:eastAsiaTheme="minorEastAsia" w:hAnsiTheme="minorHAnsi" w:cstheme="minorBidi"/>
               <w:noProof/>
-              <w:color w:val="000000" w:themeColor="text1"/>
+              <w:kern w:val="2"/>
+              <w14:ligatures w14:val="standardContextual"/>
             </w:rPr>
           </w:pPr>
-          <w:hyperlink w:anchor="_Toc242260285" w:history="1">
+          <w:hyperlink w:anchor="_Toc242782518" w:history="1">
             <w:r>
               <w:rPr>
                 <w:rStyle w:val="Hyperlink"/>
-                <w:rFonts w:asciiTheme="minorHAnsi" w:hAnsiTheme="minorHAnsi"/>
-                <w:noProof/>
-                <w:color w:val="000000" w:themeColor="text1"/>
+                <w:rFonts w:asciiTheme="majorHAnsi" w:hAnsiTheme="majorHAnsi"/>
+                <w:noProof/>
               </w:rPr>
               <w:t>Review the Lakehouse Output</w:t>
             </w:r>
             <w:r>
               <w:rPr>
-                <w:rFonts w:asciiTheme="minorHAnsi" w:hAnsiTheme="minorHAnsi"/>
-                <w:noProof/>
-                <w:webHidden/>
-                <w:color w:val="000000" w:themeColor="text1"/>
+                <w:noProof/>
+                <w:webHidden/>
               </w:rPr>
               <w:tab/>
             </w:r>
             <w:r>
               <w:rPr>
-                <w:rFonts w:asciiTheme="minorHAnsi" w:hAnsiTheme="minorHAnsi"/>
-                <w:noProof/>
-                <w:webHidden/>
-                <w:color w:val="000000" w:themeColor="text1"/>
+                <w:noProof/>
+                <w:webHidden/>
               </w:rPr>
               <w:fldChar w:fldCharType="begin"/>
             </w:r>
             <w:r>
               <w:rPr>
-                <w:rFonts w:asciiTheme="minorHAnsi" w:hAnsiTheme="minorHAnsi"/>
-                <w:noProof/>
-                <w:webHidden/>
-                <w:color w:val="000000" w:themeColor="text1"/>
-              </w:rPr>
-              <w:instrText xml:space="preserve"> PAGEREF _Toc242260285 \h </w:instrText>
-            </w:r>
-            <w:r>
-              <w:rPr>
-                <w:rFonts w:asciiTheme="minorHAnsi" w:hAnsiTheme="minorHAnsi"/>
-                <w:noProof/>
-                <w:webHidden/>
-                <w:color w:val="000000" w:themeColor="text1"/>
-              </w:rPr>
-            </w:r>
-            <w:r>
-              <w:rPr>
-                <w:rFonts w:asciiTheme="minorHAnsi" w:hAnsiTheme="minorHAnsi"/>
-                <w:noProof/>
-                <w:webHidden/>
-                <w:color w:val="000000" w:themeColor="text1"/>
+                <w:noProof/>
+                <w:webHidden/>
+              </w:rPr>
+              <w:instrText xml:space="preserve"> PAGEREF _Toc242782518 \h </w:instrText>
+            </w:r>
+            <w:r>
+              <w:rPr>
+                <w:noProof/>
+                <w:webHidden/>
+              </w:rPr>
+            </w:r>
+            <w:r>
+              <w:rPr>
+                <w:noProof/>
+                <w:webHidden/>
               </w:rPr>
               <w:fldChar w:fldCharType="separate"/>
             </w:r>
             <w:r>
               <w:rPr>
-                <w:rFonts w:asciiTheme="minorHAnsi" w:hAnsiTheme="minorHAnsi"/>
-                <w:noProof/>
-                <w:webHidden/>
-                <w:color w:val="000000" w:themeColor="text1"/>
-              </w:rPr>
-              <w:t>7</w:t>
-            </w:r>
-            <w:r>
-              <w:rPr>
-                <w:rFonts w:asciiTheme="minorHAnsi" w:hAnsiTheme="minorHAnsi"/>
-                <w:noProof/>
-                <w:webHidden/>
-                <w:color w:val="000000" w:themeColor="text1"/>
+                <w:noProof/>
+                <w:webHidden/>
+              </w:rPr>
+              <w:t>9</w:t>
+            </w:r>
+            <w:r>
+              <w:rPr>
+                <w:noProof/>
+                <w:webHidden/>
               </w:rPr>
               <w:fldChar w:fldCharType="end"/>
             </w:r>
@@ -1526,80 +1381,66 @@
               <w:tab w:val="right" w:leader="dot" w:pos="9016"/>
             </w:tabs>
             <w:rPr>
-              <w:rFonts w:asciiTheme="minorHAnsi" w:hAnsiTheme="minorHAnsi"/>
+              <w:rFonts w:asciiTheme="minorHAnsi" w:eastAsiaTheme="minorEastAsia" w:hAnsiTheme="minorHAnsi" w:cstheme="minorBidi"/>
               <w:noProof/>
-              <w:color w:val="000000" w:themeColor="text1"/>
+              <w:kern w:val="2"/>
+              <w14:ligatures w14:val="standardContextual"/>
             </w:rPr>
           </w:pPr>
-          <w:hyperlink w:anchor="_Toc242260286" w:history="1">
+          <w:hyperlink w:anchor="_Toc242782519" w:history="1">
             <w:r>
               <w:rPr>
                 <w:rStyle w:val="Hyperlink"/>
-                <w:rFonts w:asciiTheme="minorHAnsi" w:hAnsiTheme="minorHAnsi"/>
-                <w:noProof/>
-                <w:color w:val="000000" w:themeColor="text1"/>
+                <w:rFonts w:asciiTheme="majorHAnsi" w:hAnsiTheme="majorHAnsi"/>
+                <w:noProof/>
               </w:rPr>
               <w:t>Connect the PAX Report Templates</w:t>
             </w:r>
             <w:r>
               <w:rPr>
-                <w:rFonts w:asciiTheme="minorHAnsi" w:hAnsiTheme="minorHAnsi"/>
-                <w:noProof/>
-                <w:webHidden/>
-                <w:color w:val="000000" w:themeColor="text1"/>
+                <w:noProof/>
+                <w:webHidden/>
               </w:rPr>
               <w:tab/>
             </w:r>
             <w:r>
               <w:rPr>
-                <w:rFonts w:asciiTheme="minorHAnsi" w:hAnsiTheme="minorHAnsi"/>
-                <w:noProof/>
-                <w:webHidden/>
-                <w:color w:val="000000" w:themeColor="text1"/>
+                <w:noProof/>
+                <w:webHidden/>
               </w:rPr>
               <w:fldChar w:fldCharType="begin"/>
             </w:r>
             <w:r>
               <w:rPr>
-                <w:rFonts w:asciiTheme="minorHAnsi" w:hAnsiTheme="minorHAnsi"/>
-                <w:noProof/>
-                <w:webHidden/>
-                <w:color w:val="000000" w:themeColor="text1"/>
-              </w:rPr>
-              <w:instrText xml:space="preserve"> PAGEREF _Toc242260286 \h </w:instrText>
-            </w:r>
-            <w:r>
-              <w:rPr>
-                <w:rFonts w:asciiTheme="minorHAnsi" w:hAnsiTheme="minorHAnsi"/>
-                <w:noProof/>
-                <w:webHidden/>
-                <w:color w:val="000000" w:themeColor="text1"/>
-              </w:rPr>
-            </w:r>
-            <w:r>
-              <w:rPr>
-                <w:rFonts w:asciiTheme="minorHAnsi" w:hAnsiTheme="minorHAnsi"/>
-                <w:noProof/>
-                <w:webHidden/>
-                <w:color w:val="000000" w:themeColor="text1"/>
+                <w:noProof/>
+                <w:webHidden/>
+              </w:rPr>
+              <w:instrText xml:space="preserve"> PAGEREF _Toc242782519 \h </w:instrText>
+            </w:r>
+            <w:r>
+              <w:rPr>
+                <w:noProof/>
+                <w:webHidden/>
+              </w:rPr>
+            </w:r>
+            <w:r>
+              <w:rPr>
+                <w:noProof/>
+                <w:webHidden/>
               </w:rPr>
               <w:fldChar w:fldCharType="separate"/>
             </w:r>
             <w:r>
               <w:rPr>
-                <w:rFonts w:asciiTheme="minorHAnsi" w:hAnsiTheme="minorHAnsi"/>
-                <w:noProof/>
-                <w:webHidden/>
-                <w:color w:val="000000" w:themeColor="text1"/>
-              </w:rPr>
-              <w:t>7</w:t>
-            </w:r>
-            <w:r>
-              <w:rPr>
-                <w:rFonts w:asciiTheme="minorHAnsi" w:hAnsiTheme="minorHAnsi"/>
-                <w:noProof/>
-                <w:webHidden/>
-                <w:color w:val="000000" w:themeColor="text1"/>
+                <w:noProof/>
+                <w:webHidden/>
+              </w:rPr>
+              <w:t>9</w:t>
+            </w:r>
+            <w:r>
+              <w:rPr>
+                <w:noProof/>
+                <w:webHidden/>
               </w:rPr>
               <w:fldChar w:fldCharType="end"/>
             </w:r>
@@ -1612,80 +1453,138 @@
               <w:tab w:val="right" w:leader="dot" w:pos="9016"/>
             </w:tabs>
             <w:rPr>
-              <w:rFonts w:asciiTheme="minorHAnsi" w:hAnsiTheme="minorHAnsi"/>
+              <w:rFonts w:asciiTheme="minorHAnsi" w:eastAsiaTheme="minorEastAsia" w:hAnsiTheme="minorHAnsi" w:cstheme="minorBidi"/>
               <w:noProof/>
-              <w:color w:val="000000" w:themeColor="text1"/>
+              <w:kern w:val="2"/>
+              <w14:ligatures w14:val="standardContextual"/>
             </w:rPr>
           </w:pPr>
-          <w:hyperlink w:anchor="_Toc242260287" w:history="1">
+          <w:hyperlink w:anchor="_Toc242782520" w:history="1">
             <w:r>
               <w:rPr>
                 <w:rStyle w:val="Hyperlink"/>
-                <w:rFonts w:asciiTheme="minorHAnsi" w:hAnsiTheme="minorHAnsi"/>
-                <w:noProof/>
-                <w:color w:val="000000" w:themeColor="text1"/>
+                <w:rFonts w:asciiTheme="majorHAnsi" w:hAnsiTheme="majorHAnsi"/>
+                <w:noProof/>
+              </w:rPr>
+              <w:t>Support, Licensing and Data Handling</w:t>
+            </w:r>
+            <w:r>
+              <w:rPr>
+                <w:noProof/>
+                <w:webHidden/>
+              </w:rPr>
+              <w:tab/>
+            </w:r>
+            <w:r>
+              <w:rPr>
+                <w:noProof/>
+                <w:webHidden/>
+              </w:rPr>
+              <w:fldChar w:fldCharType="begin"/>
+            </w:r>
+            <w:r>
+              <w:rPr>
+                <w:noProof/>
+                <w:webHidden/>
+              </w:rPr>
+              <w:instrText xml:space="preserve"> PAGEREF _Toc242782520 \h </w:instrText>
+            </w:r>
+            <w:r>
+              <w:rPr>
+                <w:noProof/>
+                <w:webHidden/>
+              </w:rPr>
+            </w:r>
+            <w:r>
+              <w:rPr>
+                <w:noProof/>
+                <w:webHidden/>
+              </w:rPr>
+              <w:fldChar w:fldCharType="separate"/>
+            </w:r>
+            <w:r>
+              <w:rPr>
+                <w:noProof/>
+                <w:webHidden/>
+              </w:rPr>
+              <w:t>10</w:t>
+            </w:r>
+            <w:r>
+              <w:rPr>
+                <w:noProof/>
+                <w:webHidden/>
+              </w:rPr>
+              <w:fldChar w:fldCharType="end"/>
+            </w:r>
+          </w:hyperlink>
+        </w:p>
+        <w:p>
+          <w:pPr>
+            <w:pStyle w:val="TOC1"/>
+            <w:tabs>
+              <w:tab w:val="right" w:leader="dot" w:pos="9016"/>
+            </w:tabs>
+            <w:rPr>
+              <w:rFonts w:asciiTheme="minorHAnsi" w:eastAsiaTheme="minorEastAsia" w:hAnsiTheme="minorHAnsi" w:cstheme="minorBidi"/>
+              <w:noProof/>
+              <w:kern w:val="2"/>
+              <w14:ligatures w14:val="standardContextual"/>
+            </w:rPr>
+          </w:pPr>
+          <w:hyperlink w:anchor="_Toc242782521" w:history="1">
+            <w:r>
+              <w:rPr>
+                <w:rStyle w:val="Hyperlink"/>
+                <w:rFonts w:asciiTheme="majorHAnsi" w:hAnsiTheme="majorHAnsi"/>
+                <w:noProof/>
               </w:rPr>
               <w:t>Related Fabric Resources</w:t>
             </w:r>
             <w:r>
               <w:rPr>
-                <w:rFonts w:asciiTheme="minorHAnsi" w:hAnsiTheme="minorHAnsi"/>
-                <w:noProof/>
-                <w:webHidden/>
-                <w:color w:val="000000" w:themeColor="text1"/>
+                <w:noProof/>
+                <w:webHidden/>
               </w:rPr>
               <w:tab/>
             </w:r>
             <w:r>
               <w:rPr>
-                <w:rFonts w:asciiTheme="minorHAnsi" w:hAnsiTheme="minorHAnsi"/>
-                <w:noProof/>
-                <w:webHidden/>
-                <w:color w:val="000000" w:themeColor="text1"/>
+                <w:noProof/>
+                <w:webHidden/>
               </w:rPr>
               <w:fldChar w:fldCharType="begin"/>
             </w:r>
             <w:r>
               <w:rPr>
-                <w:rFonts w:asciiTheme="minorHAnsi" w:hAnsiTheme="minorHAnsi"/>
-                <w:noProof/>
-                <w:webHidden/>
-                <w:color w:val="000000" w:themeColor="text1"/>
-              </w:rPr>
-              <w:instrText xml:space="preserve"> PAGEREF _Toc242260287 \h </w:instrText>
-            </w:r>
-            <w:r>
-              <w:rPr>
-                <w:rFonts w:asciiTheme="minorHAnsi" w:hAnsiTheme="minorHAnsi"/>
-                <w:noProof/>
-                <w:webHidden/>
-                <w:color w:val="000000" w:themeColor="text1"/>
-              </w:rPr>
-            </w:r>
-            <w:r>
-              <w:rPr>
-                <w:rFonts w:asciiTheme="minorHAnsi" w:hAnsiTheme="minorHAnsi"/>
-                <w:noProof/>
-                <w:webHidden/>
-                <w:color w:val="000000" w:themeColor="text1"/>
+                <w:noProof/>
+                <w:webHidden/>
+              </w:rPr>
+              <w:instrText xml:space="preserve"> PAGEREF _Toc242782521 \h </w:instrText>
+            </w:r>
+            <w:r>
+              <w:rPr>
+                <w:noProof/>
+                <w:webHidden/>
+              </w:rPr>
+            </w:r>
+            <w:r>
+              <w:rPr>
+                <w:noProof/>
+                <w:webHidden/>
               </w:rPr>
               <w:fldChar w:fldCharType="separate"/>
             </w:r>
             <w:r>
               <w:rPr>
-                <w:rFonts w:asciiTheme="minorHAnsi" w:hAnsiTheme="minorHAnsi"/>
-                <w:noProof/>
-                <w:webHidden/>
-                <w:color w:val="000000" w:themeColor="text1"/>
-              </w:rPr>
-              <w:t>8</w:t>
-            </w:r>
-            <w:r>
-              <w:rPr>
-                <w:rFonts w:asciiTheme="minorHAnsi" w:hAnsiTheme="minorHAnsi"/>
-                <w:noProof/>
-                <w:webHidden/>
-                <w:color w:val="000000" w:themeColor="text1"/>
+                <w:noProof/>
+                <w:webHidden/>
+              </w:rPr>
+              <w:t>10</w:t>
+            </w:r>
+            <w:r>
+              <w:rPr>
+                <w:noProof/>
+                <w:webHidden/>
               </w:rPr>
               <w:fldChar w:fldCharType="end"/>
             </w:r>
@@ -1694,6 +1593,7 @@
         <w:p>
           <w:r>
             <w:rPr>
+              <w:rFonts w:asciiTheme="minorHAnsi" w:hAnsiTheme="minorHAnsi"/>
               <w:b/>
               <w:bCs/>
               <w:noProof/>
@@ -1711,7 +1611,7 @@
           <w:rFonts w:asciiTheme="majorHAnsi" w:hAnsiTheme="majorHAnsi"/>
         </w:rPr>
       </w:pPr>
-      <w:bookmarkStart w:id="0" w:name="_Toc242260270"/>
+      <w:bookmarkStart w:id="0" w:name="_Toc242782503"/>
       <w:r>
         <w:rPr>
           <w:rFonts w:asciiTheme="majorHAnsi" w:hAnsiTheme="majorHAnsi"/>
@@ -1719,29 +1619,28 @@
           <w:bCs w:val="0"/>
           <w:color w:val="0F4761" w:themeColor="accent1" w:themeShade="BF"/>
         </w:rPr>
-        <w:lastRenderedPageBreak/>
-        <w:t>What You Can Do with PAX Fabric - Enterprise AI Analytics Pipeline</w:t>
+        <w:t>What You Can Do with PAX Fabric</w:t>
       </w:r>
       <w:bookmarkEnd w:id="0"/>
-      <w:r>
-        <w:rPr>
-          <w:rFonts w:asciiTheme="majorHAnsi" w:hAnsiTheme="majorHAnsi"/>
+    </w:p>
+    <w:p>
+      <w:pPr>
+        <w:spacing w:after="120"/>
+        <w:rPr>
+          <w:rFonts w:asciiTheme="minorHAnsi" w:hAnsiTheme="minorHAnsi"/>
+        </w:rPr>
+      </w:pPr>
+      <w:r>
+        <w:rPr>
+          <w:rFonts w:asciiTheme="minorHAnsi" w:hAnsiTheme="minorHAnsi"/>
+        </w:rPr>
+        <w:t>PAX Fabric enables you to:</w:t>
+      </w:r>
+      <w:r>
+        <w:rPr>
+          <w:rFonts w:asciiTheme="minorHAnsi" w:hAnsiTheme="minorHAnsi"/>
         </w:rPr>
         <w:t xml:space="preserve"> </w:t>
-      </w:r>
-    </w:p>
-    <w:p>
-      <w:pPr>
-        <w:spacing w:after="120"/>
-        <w:rPr>
-          <w:rFonts w:asciiTheme="minorHAnsi" w:hAnsiTheme="minorHAnsi"/>
-        </w:rPr>
-      </w:pPr>
-      <w:r>
-        <w:rPr>
-          <w:rFonts w:asciiTheme="minorHAnsi" w:hAnsiTheme="minorHAnsi"/>
-        </w:rPr>
-        <w:t xml:space="preserve">PAX Fabric - Enterprise AI Analytics Pipeline enables you to: </w:t>
       </w:r>
     </w:p>
     <w:p>
@@ -1760,7 +1659,7 @@
         <w:rPr>
           <w:rFonts w:asciiTheme="minorHAnsi" w:hAnsiTheme="minorHAnsi"/>
         </w:rPr>
-        <w:t>Consolidate supported activity, usage, and consumption data in a single Lakehouse.</w:t>
+        <w:t>Consolidate supported AI activity and Microsoft 365 usage data in a single Lakehouse.</w:t>
       </w:r>
     </w:p>
     <w:p>
@@ -1950,7 +1849,7 @@
           <w:rFonts w:asciiTheme="majorHAnsi" w:hAnsiTheme="majorHAnsi"/>
         </w:rPr>
       </w:pPr>
-      <w:bookmarkStart w:id="1" w:name="_Toc242260271"/>
+      <w:bookmarkStart w:id="1" w:name="_Toc242782504"/>
       <w:r>
         <w:rPr>
           <w:rFonts w:asciiTheme="majorHAnsi" w:hAnsiTheme="majorHAnsi"/>
@@ -1958,7 +1857,7 @@
           <w:bCs w:val="0"/>
           <w:color w:val="0F4761" w:themeColor="accent1" w:themeShade="BF"/>
         </w:rPr>
-        <w:t>How PAX Fabric - Enterprise AI Analytics Pipeline Works</w:t>
+        <w:t>How PAX Fabric Works</w:t>
       </w:r>
       <w:bookmarkEnd w:id="1"/>
     </w:p>
@@ -2028,7 +1927,7 @@
           <w:color w:val="0F4761" w:themeColor="accent1" w:themeShade="BF"/>
         </w:rPr>
       </w:pPr>
-      <w:bookmarkStart w:id="2" w:name="_Toc242260272"/>
+      <w:bookmarkStart w:id="2" w:name="_Toc242782505"/>
       <w:r>
         <w:rPr>
           <w:rFonts w:asciiTheme="majorHAnsi" w:hAnsiTheme="majorHAnsi"/>
@@ -2123,7 +2022,7 @@
           <w:rFonts w:asciiTheme="majorHAnsi" w:hAnsiTheme="majorHAnsi"/>
         </w:rPr>
       </w:pPr>
-      <w:bookmarkStart w:id="3" w:name="_Toc242260273"/>
+      <w:bookmarkStart w:id="3" w:name="_Toc242782506"/>
       <w:r>
         <w:rPr>
           <w:rFonts w:asciiTheme="majorHAnsi" w:hAnsiTheme="majorHAnsi"/>
@@ -2131,12 +2030,27 @@
           <w:bCs w:val="0"/>
           <w:color w:val="0F4761" w:themeColor="accent1" w:themeShade="BF"/>
         </w:rPr>
-        <w:t>Fabric Resources Flow</w:t>
+        <w:t>Solution Resources and Services Flow</w:t>
       </w:r>
       <w:bookmarkEnd w:id="3"/>
-      <w:r>
-        <w:rPr>
-          <w:rFonts w:asciiTheme="majorHAnsi" w:hAnsiTheme="majorHAnsi"/>
+    </w:p>
+    <w:p>
+      <w:pPr>
+        <w:spacing w:after="120"/>
+        <w:rPr>
+          <w:rFonts w:asciiTheme="minorHAnsi" w:hAnsiTheme="minorHAnsi"/>
+        </w:rPr>
+      </w:pPr>
+      <w:r>
+        <w:rPr>
+          <w:rFonts w:asciiTheme="minorHAnsi" w:hAnsiTheme="minorHAnsi"/>
+        </w:rPr>
+        <w:lastRenderedPageBreak/>
+        <w:t>The PAX Fabric Pipeline item is the user entry point and control plane. It connects Microsoft Entra identity, Azure Key Vault, the public PAX-Fabric GitHub repository, Microsoft 365 data sources, and the Fabric resources that perform collection, transformation, storage, and reporting:</w:t>
+      </w:r>
+      <w:r>
+        <w:rPr>
+          <w:rFonts w:asciiTheme="minorHAnsi" w:hAnsiTheme="minorHAnsi"/>
         </w:rPr>
         <w:t xml:space="preserve"> </w:t>
       </w:r>
@@ -2151,40 +2065,31 @@
       <w:r>
         <w:rPr>
           <w:rFonts w:asciiTheme="minorHAnsi" w:hAnsiTheme="minorHAnsi"/>
-        </w:rPr>
-        <w:t xml:space="preserve">The workload deploys and connects the Fabric resources that perform collection, transformation, storage, and reporting: </w:t>
-      </w:r>
-    </w:p>
-    <w:p>
-      <w:pPr>
-        <w:spacing w:after="120"/>
-        <w:rPr>
-          <w:rFonts w:asciiTheme="minorHAnsi" w:hAnsiTheme="minorHAnsi"/>
-        </w:rPr>
-      </w:pPr>
-      <w:r>
-        <w:rPr>
-          <w:rFonts w:asciiTheme="minorHAnsi" w:hAnsiTheme="minorHAnsi"/>
           <w:noProof/>
         </w:rPr>
-        <w:lastRenderedPageBreak/>
         <w:drawing>
-          <wp:inline distT="0" distB="0" distL="0" distR="0" wp14:anchorId="792977DD" wp14:editId="0B9B1450">
+          <wp:inline distT="0" distB="0" distL="0" distR="0" wp14:anchorId="4B8A9D7B" wp14:editId="72127EF9">
             <wp:extent cx="5731510" cy="1870710"/>
             <wp:effectExtent l="0" t="0" r="2540" b="0"/>
-            <wp:docPr id="1465386570" name="Picture 1"/>
+            <wp:docPr id="1843464519" name="Picture 1" descr="PAX Fabric solution resources and services flow"/>
             <wp:cNvGraphicFramePr>
-              <a:graphicFrameLocks xmlns:a="http://schemas.openxmlformats.org/drawingml/2006/main" noChangeAspect="1"/>
+              <a:graphicFrameLocks xmlns:a="http://schemas.openxmlformats.org/drawingml/2006/main"/>
             </wp:cNvGraphicFramePr>
             <a:graphic xmlns:a="http://schemas.openxmlformats.org/drawingml/2006/main">
               <a:graphicData uri="http://schemas.openxmlformats.org/drawingml/2006/picture">
                 <pic:pic xmlns:pic="http://schemas.openxmlformats.org/drawingml/2006/picture">
                   <pic:nvPicPr>
-                    <pic:cNvPr id="1465386570" name=""/>
+                    <pic:cNvPr id="1843464519" name="Picture 1" descr="PAX Fabric solution resources and services flow"/>
                     <pic:cNvPicPr/>
                   </pic:nvPicPr>
                   <pic:blipFill>
-                    <a:blip r:embed="rId10"/>
+                    <a:blip r:embed="rId10" cstate="print">
+                      <a:extLst>
+                        <a:ext uri="{28A0092B-C50C-407E-A947-70E740481C1C}">
+                          <a14:useLocalDpi xmlns:a14="http://schemas.microsoft.com/office/drawing/2010/main" val="0"/>
+                        </a:ext>
+                      </a:extLst>
+                    </a:blip>
                     <a:stretch>
                       <a:fillRect/>
                     </a:stretch>
@@ -2220,7 +2125,7 @@
           <w:rFonts w:asciiTheme="majorHAnsi" w:hAnsiTheme="majorHAnsi"/>
         </w:rPr>
       </w:pPr>
-      <w:bookmarkStart w:id="4" w:name="_Toc242260274"/>
+      <w:bookmarkStart w:id="4" w:name="_Toc242782507"/>
       <w:r>
         <w:rPr>
           <w:rFonts w:asciiTheme="majorHAnsi" w:hAnsiTheme="majorHAnsi"/>
@@ -2392,7 +2297,7 @@
               <w:rPr>
                 <w:rFonts w:asciiTheme="minorHAnsi" w:hAnsiTheme="minorHAnsi"/>
               </w:rPr>
-              <w:t>Stores processed activity, usage, consumption, user, agent, and dimensional data as Delta tables in OneLake.</w:t>
+              <w:t>Stores processed AI activity, Microsoft 365 usage, user, agent, and dimensional data as Delta tables in OneLake.</w:t>
             </w:r>
           </w:p>
         </w:tc>
@@ -2509,7 +2414,7 @@
           <w:rFonts w:asciiTheme="majorHAnsi" w:hAnsiTheme="majorHAnsi"/>
         </w:rPr>
       </w:pPr>
-      <w:bookmarkStart w:id="5" w:name="_Toc242260275"/>
+      <w:bookmarkStart w:id="5" w:name="_Toc242782508"/>
       <w:r>
         <w:rPr>
           <w:rFonts w:asciiTheme="majorHAnsi" w:hAnsiTheme="majorHAnsi"/>
@@ -2557,7 +2462,7 @@
         <w:rPr>
           <w:rFonts w:asciiTheme="minorHAnsi" w:hAnsiTheme="minorHAnsi"/>
         </w:rPr>
-        <w:t>The PAX Fabric - Enterprise AI Analytics Pipeline workload is enabled and visible in your Fabric tenant.</w:t>
+        <w:t>PAX Fabric is enabled and visible in your Fabric tenant.</w:t>
       </w:r>
     </w:p>
     <w:p>
@@ -2633,6 +2538,7 @@
         <w:rPr>
           <w:rFonts w:asciiTheme="minorHAnsi" w:hAnsiTheme="minorHAnsi"/>
         </w:rPr>
+        <w:lastRenderedPageBreak/>
         <w:t>The application credential is stored in Azure Key Vault.</w:t>
       </w:r>
     </w:p>
@@ -2671,7 +2577,6 @@
         <w:rPr>
           <w:rFonts w:asciiTheme="minorHAnsi" w:hAnsiTheme="minorHAnsi"/>
         </w:rPr>
-        <w:lastRenderedPageBreak/>
         <w:t>You have selected the Lakehouse schema in which PAX output tables will be created.</w:t>
       </w:r>
     </w:p>
@@ -2696,6 +2601,468 @@
     </w:p>
     <w:p>
       <w:pPr>
+        <w:pStyle w:val="ListParagraph"/>
+        <w:numPr>
+          <w:ilvl w:val="0"/>
+          <w:numId w:val="4"/>
+        </w:numPr>
+        <w:rPr>
+          <w:rFonts w:asciiTheme="minorHAnsi" w:hAnsiTheme="minorHAnsi"/>
+        </w:rPr>
+      </w:pPr>
+      <w:r>
+        <w:rPr>
+          <w:rFonts w:asciiTheme="minorHAnsi" w:hAnsiTheme="minorHAnsi"/>
+        </w:rPr>
+        <w:t>Microsoft Purview Audit is enabled for the tenant.</w:t>
+      </w:r>
+    </w:p>
+    <w:p>
+      <w:pPr>
+        <w:pStyle w:val="ListParagraph"/>
+        <w:numPr>
+          <w:ilvl w:val="0"/>
+          <w:numId w:val="4"/>
+        </w:numPr>
+        <w:rPr>
+          <w:rFonts w:asciiTheme="minorHAnsi" w:hAnsiTheme="minorHAnsi"/>
+        </w:rPr>
+      </w:pPr>
+      <w:r>
+        <w:rPr>
+          <w:rFonts w:asciiTheme="minorHAnsi" w:hAnsiTheme="minorHAnsi"/>
+        </w:rPr>
+        <w:t>The user who runs an on-demand pipeline and the owner of each schedule have the Key Vault Secrets User role on the vault.</w:t>
+      </w:r>
+    </w:p>
+    <w:p>
+      <w:pPr>
+        <w:pStyle w:val="ListParagraph"/>
+        <w:numPr>
+          <w:ilvl w:val="0"/>
+          <w:numId w:val="4"/>
+        </w:numPr>
+        <w:rPr>
+          <w:rFonts w:asciiTheme="minorHAnsi" w:hAnsiTheme="minorHAnsi"/>
+        </w:rPr>
+      </w:pPr>
+      <w:r>
+        <w:rPr>
+          <w:rFonts w:asciiTheme="minorHAnsi" w:hAnsiTheme="minorHAnsi"/>
+        </w:rPr>
+        <w:t>You have confirmed the tenant's available audit history. Microsoft Purview Audit (Standard) retains audit records for 180 days by default; licensing and retention policies can provide a different window.</w:t>
+      </w:r>
+    </w:p>
+    <w:p>
+      <w:pPr>
+        <w:pStyle w:val="ListParagraph"/>
+        <w:numPr>
+          <w:ilvl w:val="0"/>
+          <w:numId w:val="4"/>
+        </w:numPr>
+        <w:rPr>
+          <w:rFonts w:asciiTheme="minorHAnsi" w:hAnsiTheme="minorHAnsi"/>
+        </w:rPr>
+      </w:pPr>
+      <w:r>
+        <w:rPr>
+          <w:rFonts w:asciiTheme="minorHAnsi" w:hAnsiTheme="minorHAnsi"/>
+        </w:rPr>
+        <w:t>The Fabric capacity can support the requested backfill. Large historical windows can run for hours or days and consume significant capacity.</w:t>
+      </w:r>
+    </w:p>
+    <w:p/>
+    <w:p>
+      <w:pPr>
+        <w:rPr>
+          <w:rFonts w:asciiTheme="minorHAnsi" w:hAnsiTheme="minorHAnsi"/>
+        </w:rPr>
+      </w:pPr>
+      <w:r>
+        <w:rPr>
+          <w:rFonts w:asciiTheme="minorHAnsi" w:hAnsiTheme="minorHAnsi"/>
+        </w:rPr>
+        <w:t>Grant tenant-wide administrator consent for these Microsoft Graph application permissions:</w:t>
+      </w:r>
+    </w:p>
+    <w:tbl>
+      <w:tblPr>
+        <w:tblW w:w="0" w:type="auto"/>
+        <w:tblBorders>
+          <w:top w:val="single" w:sz="4" w:space="0" w:color="auto"/>
+          <w:left w:val="single" w:sz="4" w:space="0" w:color="auto"/>
+          <w:bottom w:val="single" w:sz="4" w:space="0" w:color="auto"/>
+          <w:right w:val="single" w:sz="4" w:space="0" w:color="auto"/>
+          <w:insideH w:val="single" w:sz="4" w:space="0" w:color="auto"/>
+          <w:insideV w:val="single" w:sz="4" w:space="0" w:color="auto"/>
+        </w:tblBorders>
+        <w:tblLayout w:type="fixed"/>
+        <w:tblLook w:val="04A0" w:firstRow="1" w:lastRow="0" w:firstColumn="1" w:lastColumn="0" w:noHBand="0" w:noVBand="1"/>
+      </w:tblPr>
+      <w:tblGrid>
+        <w:gridCol w:w="4513"/>
+        <w:gridCol w:w="4513"/>
+      </w:tblGrid>
+      <w:tr>
+        <w:tc>
+          <w:tcPr>
+            <w:tcW w:w="4513" w:type="dxa"/>
+          </w:tcPr>
+          <w:p>
+            <w:pPr>
+              <w:spacing w:after="120"/>
+              <w:rPr>
+                <w:rFonts w:asciiTheme="minorHAnsi" w:hAnsiTheme="minorHAnsi"/>
+                <w:b/>
+                <w:bCs/>
+              </w:rPr>
+            </w:pPr>
+            <w:r>
+              <w:rPr>
+                <w:rFonts w:asciiTheme="minorHAnsi" w:hAnsiTheme="minorHAnsi"/>
+                <w:b/>
+                <w:bCs/>
+              </w:rPr>
+              <w:t>Permission</w:t>
+            </w:r>
+          </w:p>
+        </w:tc>
+        <w:tc>
+          <w:tcPr>
+            <w:tcW w:w="4513" w:type="dxa"/>
+          </w:tcPr>
+          <w:p>
+            <w:pPr>
+              <w:spacing w:after="120"/>
+              <w:rPr>
+                <w:rFonts w:asciiTheme="minorHAnsi" w:hAnsiTheme="minorHAnsi"/>
+                <w:b/>
+                <w:bCs/>
+              </w:rPr>
+            </w:pPr>
+            <w:r>
+              <w:rPr>
+                <w:rFonts w:asciiTheme="minorHAnsi" w:hAnsiTheme="minorHAnsi"/>
+                <w:b/>
+                <w:bCs/>
+              </w:rPr>
+              <w:t>Needed for</w:t>
+            </w:r>
+          </w:p>
+        </w:tc>
+      </w:tr>
+      <w:tr>
+        <w:tc>
+          <w:tcPr>
+            <w:tcW w:w="4513" w:type="dxa"/>
+          </w:tcPr>
+          <w:p>
+            <w:pPr>
+              <w:spacing w:after="120"/>
+              <w:rPr>
+                <w:rFonts w:asciiTheme="minorHAnsi" w:hAnsiTheme="minorHAnsi"/>
+              </w:rPr>
+            </w:pPr>
+            <w:r>
+              <w:rPr>
+                <w:rFonts w:asciiTheme="minorHAnsi" w:hAnsiTheme="minorHAnsi"/>
+              </w:rPr>
+              <w:t>AuditLogsQuery.Read.All</w:t>
+            </w:r>
+          </w:p>
+        </w:tc>
+        <w:tc>
+          <w:tcPr>
+            <w:tcW w:w="4513" w:type="dxa"/>
+          </w:tcPr>
+          <w:p>
+            <w:pPr>
+              <w:spacing w:after="120"/>
+              <w:rPr>
+                <w:rFonts w:asciiTheme="minorHAnsi" w:hAnsiTheme="minorHAnsi"/>
+              </w:rPr>
+            </w:pPr>
+            <w:r>
+              <w:rPr>
+                <w:rFonts w:asciiTheme="minorHAnsi" w:hAnsiTheme="minorHAnsi"/>
+              </w:rPr>
+              <w:t>Microsoft Purview audit collection across the supported audit workloads.</w:t>
+            </w:r>
+          </w:p>
+        </w:tc>
+      </w:tr>
+      <w:tr>
+        <w:tc>
+          <w:tcPr>
+            <w:tcW w:w="4513" w:type="dxa"/>
+          </w:tcPr>
+          <w:p>
+            <w:pPr>
+              <w:spacing w:after="120"/>
+              <w:rPr>
+                <w:rFonts w:asciiTheme="minorHAnsi" w:hAnsiTheme="minorHAnsi"/>
+              </w:rPr>
+            </w:pPr>
+            <w:proofErr w:type="spellStart"/>
+            <w:r>
+              <w:rPr>
+                <w:rFonts w:asciiTheme="minorHAnsi" w:hAnsiTheme="minorHAnsi"/>
+              </w:rPr>
+              <w:t>User.Read.All</w:t>
+            </w:r>
+            <w:proofErr w:type="spellEnd"/>
+          </w:p>
+        </w:tc>
+        <w:tc>
+          <w:tcPr>
+            <w:tcW w:w="4513" w:type="dxa"/>
+          </w:tcPr>
+          <w:p>
+            <w:pPr>
+              <w:spacing w:after="120"/>
+              <w:rPr>
+                <w:rFonts w:asciiTheme="minorHAnsi" w:hAnsiTheme="minorHAnsi"/>
+              </w:rPr>
+            </w:pPr>
+            <w:r>
+              <w:rPr>
+                <w:rFonts w:asciiTheme="minorHAnsi" w:hAnsiTheme="minorHAnsi"/>
+              </w:rPr>
+              <w:t>Entra user collection and user-manager enrichment.</w:t>
+            </w:r>
+          </w:p>
+        </w:tc>
+      </w:tr>
+      <w:tr>
+        <w:tc>
+          <w:tcPr>
+            <w:tcW w:w="4513" w:type="dxa"/>
+          </w:tcPr>
+          <w:p>
+            <w:pPr>
+              <w:spacing w:after="120"/>
+              <w:rPr>
+                <w:rFonts w:asciiTheme="minorHAnsi" w:hAnsiTheme="minorHAnsi"/>
+              </w:rPr>
+            </w:pPr>
+            <w:proofErr w:type="spellStart"/>
+            <w:r>
+              <w:rPr>
+                <w:rFonts w:asciiTheme="minorHAnsi" w:hAnsiTheme="minorHAnsi"/>
+              </w:rPr>
+              <w:t>Organization.Read.All</w:t>
+            </w:r>
+            <w:proofErr w:type="spellEnd"/>
+          </w:p>
+        </w:tc>
+        <w:tc>
+          <w:tcPr>
+            <w:tcW w:w="4513" w:type="dxa"/>
+          </w:tcPr>
+          <w:p>
+            <w:pPr>
+              <w:spacing w:after="120"/>
+              <w:rPr>
+                <w:rFonts w:asciiTheme="minorHAnsi" w:hAnsiTheme="minorHAnsi"/>
+              </w:rPr>
+            </w:pPr>
+            <w:r>
+              <w:rPr>
+                <w:rFonts w:asciiTheme="minorHAnsi" w:hAnsiTheme="minorHAnsi"/>
+              </w:rPr>
+              <w:t>Tenant organization and subscribed-license SKU information.</w:t>
+            </w:r>
+          </w:p>
+        </w:tc>
+      </w:tr>
+      <w:tr>
+        <w:tc>
+          <w:tcPr>
+            <w:tcW w:w="4513" w:type="dxa"/>
+          </w:tcPr>
+          <w:p>
+            <w:pPr>
+              <w:spacing w:after="120"/>
+              <w:rPr>
+                <w:rFonts w:asciiTheme="minorHAnsi" w:hAnsiTheme="minorHAnsi"/>
+              </w:rPr>
+            </w:pPr>
+            <w:proofErr w:type="spellStart"/>
+            <w:r>
+              <w:rPr>
+                <w:rFonts w:asciiTheme="minorHAnsi" w:hAnsiTheme="minorHAnsi"/>
+              </w:rPr>
+              <w:t>GroupMember.Read.All</w:t>
+            </w:r>
+            <w:proofErr w:type="spellEnd"/>
+          </w:p>
+        </w:tc>
+        <w:tc>
+          <w:tcPr>
+            <w:tcW w:w="4513" w:type="dxa"/>
+          </w:tcPr>
+          <w:p>
+            <w:pPr>
+              <w:spacing w:after="120"/>
+              <w:rPr>
+                <w:rFonts w:asciiTheme="minorHAnsi" w:hAnsiTheme="minorHAnsi"/>
+              </w:rPr>
+            </w:pPr>
+            <w:r>
+              <w:rPr>
+                <w:rFonts w:asciiTheme="minorHAnsi" w:hAnsiTheme="minorHAnsi"/>
+              </w:rPr>
+              <w:t>Group filtering and transitive group-member expansion.</w:t>
+            </w:r>
+          </w:p>
+        </w:tc>
+      </w:tr>
+      <w:tr>
+        <w:tc>
+          <w:tcPr>
+            <w:tcW w:w="4513" w:type="dxa"/>
+          </w:tcPr>
+          <w:p>
+            <w:pPr>
+              <w:spacing w:after="120"/>
+              <w:rPr>
+                <w:rFonts w:asciiTheme="minorHAnsi" w:hAnsiTheme="minorHAnsi"/>
+              </w:rPr>
+            </w:pPr>
+            <w:proofErr w:type="spellStart"/>
+            <w:r>
+              <w:rPr>
+                <w:rFonts w:asciiTheme="minorHAnsi" w:hAnsiTheme="minorHAnsi"/>
+              </w:rPr>
+              <w:t>CopilotPackages.Read.All</w:t>
+            </w:r>
+            <w:proofErr w:type="spellEnd"/>
+          </w:p>
+        </w:tc>
+        <w:tc>
+          <w:tcPr>
+            <w:tcW w:w="4513" w:type="dxa"/>
+          </w:tcPr>
+          <w:p>
+            <w:pPr>
+              <w:spacing w:after="120"/>
+              <w:rPr>
+                <w:rFonts w:asciiTheme="minorHAnsi" w:hAnsiTheme="minorHAnsi"/>
+              </w:rPr>
+            </w:pPr>
+            <w:r>
+              <w:rPr>
+                <w:rFonts w:asciiTheme="minorHAnsi" w:hAnsiTheme="minorHAnsi"/>
+              </w:rPr>
+              <w:t xml:space="preserve">Agent 365 </w:t>
+            </w:r>
+            <w:proofErr w:type="spellStart"/>
+            <w:r>
+              <w:rPr>
+                <w:rFonts w:asciiTheme="minorHAnsi" w:hAnsiTheme="minorHAnsi"/>
+              </w:rPr>
+              <w:t>catalog</w:t>
+            </w:r>
+            <w:proofErr w:type="spellEnd"/>
+            <w:r>
+              <w:rPr>
+                <w:rFonts w:asciiTheme="minorHAnsi" w:hAnsiTheme="minorHAnsi"/>
+              </w:rPr>
+              <w:t xml:space="preserve"> collection.</w:t>
+            </w:r>
+          </w:p>
+        </w:tc>
+      </w:tr>
+    </w:tbl>
+    <w:p>
+      <w:pPr>
+        <w:rPr>
+          <w:rFonts w:asciiTheme="minorHAnsi" w:hAnsiTheme="minorHAnsi"/>
+        </w:rPr>
+      </w:pPr>
+    </w:p>
+    <w:p>
+      <w:pPr>
+        <w:rPr>
+          <w:rFonts w:asciiTheme="minorHAnsi" w:hAnsiTheme="minorHAnsi"/>
+        </w:rPr>
+      </w:pPr>
+      <w:r>
+        <w:rPr>
+          <w:rFonts w:asciiTheme="minorHAnsi" w:hAnsiTheme="minorHAnsi"/>
+        </w:rPr>
+        <w:t xml:space="preserve">When </w:t>
+      </w:r>
+      <w:r>
+        <w:rPr>
+          <w:rFonts w:asciiTheme="minorHAnsi" w:hAnsiTheme="minorHAnsi"/>
+          <w:i/>
+          <w:iCs/>
+        </w:rPr>
+        <w:t>AuditLogsQuery.Read.All</w:t>
+      </w:r>
+      <w:r>
+        <w:rPr>
+          <w:rFonts w:asciiTheme="minorHAnsi" w:hAnsiTheme="minorHAnsi"/>
+        </w:rPr>
+        <w:t xml:space="preserve"> is granted, </w:t>
+      </w:r>
+      <w:proofErr w:type="spellStart"/>
+      <w:r>
+        <w:rPr>
+          <w:rFonts w:asciiTheme="minorHAnsi" w:hAnsiTheme="minorHAnsi"/>
+          <w:i/>
+          <w:iCs/>
+        </w:rPr>
+        <w:t>AuditLogsQuery-Exchange.Read.All</w:t>
+      </w:r>
+      <w:proofErr w:type="spellEnd"/>
+      <w:r>
+        <w:rPr>
+          <w:rFonts w:asciiTheme="minorHAnsi" w:hAnsiTheme="minorHAnsi"/>
+        </w:rPr>
+        <w:t xml:space="preserve">, </w:t>
+      </w:r>
+      <w:r>
+        <w:rPr>
+          <w:rFonts w:asciiTheme="minorHAnsi" w:hAnsiTheme="minorHAnsi"/>
+          <w:i/>
+          <w:iCs/>
+        </w:rPr>
+        <w:t>AuditLogsQuery-OneDrive.Read.All</w:t>
+      </w:r>
+      <w:r>
+        <w:rPr>
+          <w:rFonts w:asciiTheme="minorHAnsi" w:hAnsiTheme="minorHAnsi"/>
+        </w:rPr>
+        <w:t xml:space="preserve">, and </w:t>
+      </w:r>
+      <w:proofErr w:type="spellStart"/>
+      <w:r>
+        <w:rPr>
+          <w:rFonts w:asciiTheme="minorHAnsi" w:hAnsiTheme="minorHAnsi"/>
+          <w:i/>
+          <w:iCs/>
+        </w:rPr>
+        <w:t>AuditLogsQuery-SharePoint.Read.Al</w:t>
+      </w:r>
+      <w:r>
+        <w:rPr>
+          <w:rFonts w:asciiTheme="minorHAnsi" w:hAnsiTheme="minorHAnsi"/>
+        </w:rPr>
+        <w:t>l</w:t>
+      </w:r>
+      <w:proofErr w:type="spellEnd"/>
+      <w:r>
+        <w:rPr>
+          <w:rFonts w:asciiTheme="minorHAnsi" w:hAnsiTheme="minorHAnsi"/>
+        </w:rPr>
+        <w:t xml:space="preserve"> are not required. </w:t>
+      </w:r>
+    </w:p>
+    <w:p/>
+    <w:p>
+      <w:pPr>
         <w:pBdr>
           <w:left w:val="single" w:sz="12" w:space="8" w:color="BFBFBF"/>
         </w:pBdr>
@@ -2750,7 +3117,7 @@
           <w:color w:val="0F4761" w:themeColor="accent1" w:themeShade="BF"/>
         </w:rPr>
       </w:pPr>
-      <w:bookmarkStart w:id="6" w:name="_Toc242260276"/>
+      <w:bookmarkStart w:id="6" w:name="_Toc242782509"/>
       <w:r>
         <w:rPr>
           <w:rFonts w:asciiTheme="majorHAnsi" w:hAnsiTheme="majorHAnsi"/>
@@ -2783,7 +3150,7 @@
           <w:rFonts w:asciiTheme="majorHAnsi" w:hAnsiTheme="majorHAnsi"/>
         </w:rPr>
       </w:pPr>
-      <w:bookmarkStart w:id="7" w:name="_Toc242260277"/>
+      <w:bookmarkStart w:id="7" w:name="_Toc242782510"/>
       <w:r>
         <w:rPr>
           <w:rFonts w:asciiTheme="majorHAnsi" w:hAnsiTheme="majorHAnsi"/>
@@ -2812,35 +3179,14 @@
         <w:rPr>
           <w:rFonts w:asciiTheme="minorHAnsi" w:hAnsiTheme="minorHAnsi"/>
         </w:rPr>
-        <w:t xml:space="preserve">Open the PAX Fabric - Enterprise AI Analytics Pipeline workload landing page and select </w:t>
-      </w:r>
-      <w:r>
-        <w:rPr>
-          <w:rFonts w:asciiTheme="minorHAnsi" w:hAnsiTheme="minorHAnsi"/>
-          <w:b/>
-          <w:bCs/>
-        </w:rPr>
-        <w:t>PAX Fabric Pipeline</w:t>
-      </w:r>
-      <w:r>
-        <w:rPr>
-          <w:rFonts w:asciiTheme="minorHAnsi" w:hAnsiTheme="minorHAnsi"/>
-        </w:rPr>
-        <w:t xml:space="preserve"> under </w:t>
-      </w:r>
-      <w:r>
-        <w:rPr>
-          <w:rFonts w:asciiTheme="minorHAnsi" w:hAnsiTheme="minorHAnsi"/>
-          <w:b/>
-          <w:bCs/>
-        </w:rPr>
-        <w:t>Item types</w:t>
-      </w:r>
-      <w:r>
-        <w:rPr>
-          <w:rFonts w:asciiTheme="minorHAnsi" w:hAnsiTheme="minorHAnsi"/>
-        </w:rPr>
-        <w:t xml:space="preserve">. Enter an item name, select the target workspace, and create the item. </w:t>
+        <w:lastRenderedPageBreak/>
+        <w:t>Open the PAX Fabric workload landing page and select PAX Fabric Pipeline under Item types.</w:t>
+      </w:r>
+      <w:r>
+        <w:rPr>
+          <w:rFonts w:asciiTheme="minorHAnsi" w:hAnsiTheme="minorHAnsi"/>
+        </w:rPr>
+        <w:t xml:space="preserve"> Enter an item name, select the target workspace, and create the item. </w:t>
       </w:r>
     </w:p>
     <w:p>
@@ -2878,7 +3224,7 @@
           <w:rFonts w:asciiTheme="majorHAnsi" w:hAnsiTheme="majorHAnsi"/>
         </w:rPr>
       </w:pPr>
-      <w:bookmarkStart w:id="8" w:name="_Toc242260278"/>
+      <w:bookmarkStart w:id="8" w:name="_Toc242782511"/>
       <w:r>
         <w:rPr>
           <w:rFonts w:asciiTheme="majorHAnsi" w:hAnsiTheme="majorHAnsi"/>
@@ -2959,7 +3305,7 @@
           <w:rFonts w:asciiTheme="majorHAnsi" w:hAnsiTheme="majorHAnsi"/>
         </w:rPr>
       </w:pPr>
-      <w:bookmarkStart w:id="9" w:name="_Toc242260279"/>
+      <w:bookmarkStart w:id="9" w:name="_Toc242782512"/>
       <w:r>
         <w:rPr>
           <w:rFonts w:asciiTheme="majorHAnsi" w:hAnsiTheme="majorHAnsi"/>
@@ -2988,7 +3334,13 @@
         <w:rPr>
           <w:rFonts w:asciiTheme="minorHAnsi" w:hAnsiTheme="minorHAnsi"/>
         </w:rPr>
-        <w:t xml:space="preserve">Complete the shared configuration for PAX Fabric - Enterprise AI Analytics Pipeline: </w:t>
+        <w:t>Complete the shared configuration for PAX Fabric:</w:t>
+      </w:r>
+      <w:r>
+        <w:rPr>
+          <w:rFonts w:asciiTheme="minorHAnsi" w:hAnsiTheme="minorHAnsi"/>
+        </w:rPr>
+        <w:t xml:space="preserve"> </w:t>
       </w:r>
     </w:p>
     <w:tbl>
@@ -3303,7 +3655,6 @@
               <w:rPr>
                 <w:rFonts w:asciiTheme="minorHAnsi" w:hAnsiTheme="minorHAnsi"/>
               </w:rPr>
-              <w:lastRenderedPageBreak/>
               <w:t>GitHub repository and reference</w:t>
             </w:r>
           </w:p>
@@ -3436,7 +3787,7 @@
               <w:rPr>
                 <w:rFonts w:asciiTheme="minorHAnsi" w:hAnsiTheme="minorHAnsi"/>
               </w:rPr>
-              <w:t>Specifies the number of days prior to today for which data is retained in the output tables. Data older than the configured period is removed.</w:t>
+              <w:t>Specifies the number of days prior to today for which data is retained. The default is 0, which retains all rows. Any positive value permanently deletes older rows at the end of every run.</w:t>
             </w:r>
           </w:p>
         </w:tc>
@@ -3471,13 +3822,20 @@
       </w:r>
     </w:p>
     <w:p>
+      <w:r>
+        <w:lastRenderedPageBreak/>
+        <w:t>The current default GitHub Ref is main. The Notebook downloads the latest code from that branch at the beginning of every run. For reproducible production runs, replace main with an approved immutable commit SHA or release tag.</w:t>
+      </w:r>
+    </w:p>
+    <w:p/>
+    <w:p>
       <w:pPr>
         <w:pStyle w:val="Heading1"/>
         <w:rPr>
           <w:rFonts w:asciiTheme="majorHAnsi" w:hAnsiTheme="majorHAnsi"/>
         </w:rPr>
       </w:pPr>
-      <w:bookmarkStart w:id="10" w:name="_Toc242260280"/>
+      <w:bookmarkStart w:id="10" w:name="_Toc242782513"/>
       <w:r>
         <w:rPr>
           <w:rFonts w:asciiTheme="majorHAnsi" w:hAnsiTheme="majorHAnsi"/>
@@ -3506,7 +3864,13 @@
         <w:rPr>
           <w:rFonts w:asciiTheme="minorHAnsi" w:hAnsiTheme="minorHAnsi"/>
         </w:rPr>
-        <w:t xml:space="preserve">PAX Fabric - Enterprise AI Analytics Pipeline separates configuration according to how it is used and where it is maintained: </w:t>
+        <w:t>PAX Fabric separates configuration according to how it is used and where it is maintained:</w:t>
+      </w:r>
+      <w:r>
+        <w:rPr>
+          <w:rFonts w:asciiTheme="minorHAnsi" w:hAnsiTheme="minorHAnsi"/>
+        </w:rPr>
+        <w:t xml:space="preserve"> </w:t>
       </w:r>
     </w:p>
     <w:tbl>
@@ -3847,31 +4211,38 @@
       <w:pPr>
         <w:spacing w:before="240"/>
         <w:rPr>
-          <w:rFonts w:asciiTheme="majorHAnsi" w:hAnsiTheme="majorHAnsi"/>
-        </w:rPr>
-      </w:pPr>
-      <w:r>
-        <w:rPr>
-          <w:rFonts w:asciiTheme="majorHAnsi" w:hAnsiTheme="majorHAnsi"/>
-        </w:rPr>
-        <w:lastRenderedPageBreak/>
+          <w:rFonts w:asciiTheme="minorHAnsi" w:hAnsiTheme="minorHAnsi"/>
+        </w:rPr>
+      </w:pPr>
+      <w:r>
+        <w:rPr>
+          <w:rFonts w:asciiTheme="minorHAnsi" w:hAnsiTheme="minorHAnsi"/>
+        </w:rPr>
         <w:t>This model allows a single PAX Fabric Pipeline item to support multiple collection profiles while using one shared set of deployed resources.</w:t>
       </w:r>
     </w:p>
     <w:p>
       <w:pPr>
-        <w:spacing w:after="200"/>
-        <w:rPr>
-          <w:rFonts w:asciiTheme="majorHAnsi" w:hAnsiTheme="majorHAnsi"/>
-        </w:rPr>
-      </w:pPr>
-      <w:r>
-        <w:rPr>
-          <w:rFonts w:asciiTheme="majorHAnsi" w:hAnsiTheme="majorHAnsi"/>
-        </w:rPr>
-        <w:t xml:space="preserve"> </w:t>
-      </w:r>
-    </w:p>
+        <w:spacing w:before="240"/>
+        <w:rPr>
+          <w:rFonts w:asciiTheme="minorHAnsi" w:hAnsiTheme="minorHAnsi"/>
+        </w:rPr>
+      </w:pPr>
+    </w:p>
+    <w:p>
+      <w:pPr>
+        <w:rPr>
+          <w:rFonts w:asciiTheme="minorHAnsi" w:hAnsiTheme="minorHAnsi"/>
+        </w:rPr>
+      </w:pPr>
+      <w:r>
+        <w:rPr>
+          <w:rFonts w:asciiTheme="minorHAnsi" w:hAnsiTheme="minorHAnsi"/>
+        </w:rPr>
+        <w:t>A run replaces existing rows in the date range it collected before adding the newly collected rows. Before running a different collection scope, edit and save a different Target Schema so overlapping scopes do not write to the same schema. Do not run differently scoped schedules concurrently while they resolve to the same Target Schema.</w:t>
+      </w:r>
+    </w:p>
+    <w:p/>
     <w:p>
       <w:pPr>
         <w:pStyle w:val="Heading1"/>
@@ -3879,7 +4250,7 @@
           <w:rFonts w:asciiTheme="majorHAnsi" w:hAnsiTheme="majorHAnsi"/>
         </w:rPr>
       </w:pPr>
-      <w:bookmarkStart w:id="11" w:name="_Toc242260281"/>
+      <w:bookmarkStart w:id="11" w:name="_Toc242782514"/>
       <w:r>
         <w:rPr>
           <w:rFonts w:asciiTheme="majorHAnsi" w:hAnsiTheme="majorHAnsi"/>
@@ -3950,6 +4321,7 @@
         <w:rPr>
           <w:rFonts w:asciiTheme="minorHAnsi" w:hAnsiTheme="minorHAnsi"/>
         </w:rPr>
+        <w:lastRenderedPageBreak/>
         <w:t xml:space="preserve">The Trigger dialog allows you to review and configure: </w:t>
       </w:r>
     </w:p>
@@ -3969,7 +4341,7 @@
         <w:rPr>
           <w:rFonts w:asciiTheme="minorHAnsi" w:hAnsiTheme="minorHAnsi"/>
         </w:rPr>
-        <w:t>The collection start and end dates.</w:t>
+        <w:t>The collection start and end dates. End Date is exclusive; for example, Start Date 2026-06-01 and End Date 2026-07-01 collect June 2026.</w:t>
       </w:r>
     </w:p>
     <w:p>
@@ -4238,12 +4610,54 @@
     </w:p>
     <w:p>
       <w:pPr>
+        <w:rPr>
+          <w:rFonts w:asciiTheme="minorHAnsi" w:hAnsiTheme="minorHAnsi"/>
+        </w:rPr>
+      </w:pPr>
+      <w:r>
+        <w:rPr>
+          <w:rFonts w:asciiTheme="minorHAnsi" w:hAnsiTheme="minorHAnsi"/>
+        </w:rPr>
+        <w:t xml:space="preserve">Enable Include Agent 365 Info when preparing AI in One or </w:t>
+      </w:r>
+      <w:proofErr w:type="spellStart"/>
+      <w:r>
+        <w:rPr>
+          <w:rFonts w:asciiTheme="minorHAnsi" w:hAnsiTheme="minorHAnsi"/>
+        </w:rPr>
+        <w:t>ValueLens</w:t>
+      </w:r>
+      <w:proofErr w:type="spellEnd"/>
+      <w:r>
+        <w:rPr>
+          <w:rFonts w:asciiTheme="minorHAnsi" w:hAnsiTheme="minorHAnsi"/>
+        </w:rPr>
+        <w:t xml:space="preserve"> data so the agent pages can display </w:t>
+      </w:r>
+      <w:proofErr w:type="spellStart"/>
+      <w:r>
+        <w:rPr>
+          <w:rFonts w:asciiTheme="minorHAnsi" w:hAnsiTheme="minorHAnsi"/>
+        </w:rPr>
+        <w:t>catalog</w:t>
+      </w:r>
+      <w:proofErr w:type="spellEnd"/>
+      <w:r>
+        <w:rPr>
+          <w:rFonts w:asciiTheme="minorHAnsi" w:hAnsiTheme="minorHAnsi"/>
+        </w:rPr>
+        <w:t xml:space="preserve"> details. When it is disabled, PAX still creates an empty Agent365 table with the expected schema so the dependent PBIT templates can connect.</w:t>
+      </w:r>
+    </w:p>
+    <w:p/>
+    <w:p>
+      <w:pPr>
         <w:pStyle w:val="Heading1"/>
         <w:rPr>
           <w:rFonts w:asciiTheme="majorHAnsi" w:hAnsiTheme="majorHAnsi"/>
         </w:rPr>
       </w:pPr>
-      <w:bookmarkStart w:id="12" w:name="_Toc242260282"/>
+      <w:bookmarkStart w:id="12" w:name="_Toc242782515"/>
       <w:r>
         <w:rPr>
           <w:rFonts w:asciiTheme="majorHAnsi" w:hAnsiTheme="majorHAnsi"/>
@@ -4300,7 +4714,13 @@
         <w:rPr>
           <w:rFonts w:asciiTheme="minorHAnsi" w:hAnsiTheme="minorHAnsi"/>
         </w:rPr>
-        <w:t xml:space="preserve">PAX Fabric - Enterprise AI Analytics Pipeline supports: </w:t>
+        <w:t>PAX Fabric supports:</w:t>
+      </w:r>
+      <w:r>
+        <w:rPr>
+          <w:rFonts w:asciiTheme="minorHAnsi" w:hAnsiTheme="minorHAnsi"/>
+        </w:rPr>
+        <w:t xml:space="preserve"> </w:t>
       </w:r>
     </w:p>
     <w:p>
@@ -4466,7 +4886,6 @@
         <w:rPr>
           <w:rFonts w:asciiTheme="minorHAnsi" w:hAnsiTheme="minorHAnsi"/>
         </w:rPr>
-        <w:lastRenderedPageBreak/>
         <w:t>Start and end date.</w:t>
       </w:r>
     </w:p>
@@ -4486,6 +4905,7 @@
         <w:rPr>
           <w:rFonts w:asciiTheme="minorHAnsi" w:hAnsiTheme="minorHAnsi"/>
         </w:rPr>
+        <w:lastRenderedPageBreak/>
         <w:t>Time zone.</w:t>
       </w:r>
     </w:p>
@@ -4556,13 +4976,27 @@
       </w:r>
     </w:p>
     <w:p>
+      <w:r>
+        <w:t xml:space="preserve">Daily is the recommended cadence because PAX collects audit data in whole UTC days. By-the-minute, hourly, interval-based, and overlapping schedules can re-collect the same day and consume capacity without providing fresher partial-day data. For routine incremental collection, use one daily schedule with </w:t>
+      </w:r>
+      <w:proofErr w:type="spellStart"/>
+      <w:r>
+        <w:t>NumberOfDays</w:t>
+      </w:r>
+      <w:proofErr w:type="spellEnd"/>
+      <w:r>
+        <w:t>=1, or use Watermark after a successful manual bootstrap.</w:t>
+      </w:r>
+    </w:p>
+    <w:p/>
+    <w:p>
       <w:pPr>
         <w:pStyle w:val="Heading1"/>
         <w:rPr>
           <w:rFonts w:asciiTheme="majorHAnsi" w:hAnsiTheme="majorHAnsi"/>
         </w:rPr>
       </w:pPr>
-      <w:bookmarkStart w:id="13" w:name="_Toc242260283"/>
+      <w:bookmarkStart w:id="13" w:name="_Toc242782516"/>
       <w:r>
         <w:rPr>
           <w:rFonts w:asciiTheme="majorHAnsi" w:hAnsiTheme="majorHAnsi"/>
@@ -4821,7 +5255,7 @@
           <w:rFonts w:asciiTheme="majorHAnsi" w:hAnsiTheme="majorHAnsi"/>
         </w:rPr>
       </w:pPr>
-      <w:bookmarkStart w:id="14" w:name="_Toc242260284"/>
+      <w:bookmarkStart w:id="14" w:name="_Toc242782517"/>
       <w:r>
         <w:rPr>
           <w:rFonts w:asciiTheme="majorHAnsi" w:hAnsiTheme="majorHAnsi"/>
@@ -4866,14 +5300,12 @@
         </w:rPr>
         <w:t xml:space="preserve"> </w:t>
       </w:r>
-      <w:proofErr w:type="gramStart"/>
-      <w:r>
-        <w:rPr>
-          <w:rFonts w:asciiTheme="minorHAnsi" w:hAnsiTheme="minorHAnsi"/>
-        </w:rPr>
-        <w:t>becomes</w:t>
-      </w:r>
-      <w:proofErr w:type="gramEnd"/>
+      <w:r>
+        <w:rPr>
+          <w:rFonts w:asciiTheme="minorHAnsi" w:hAnsiTheme="minorHAnsi"/>
+        </w:rPr>
+        <w:t>become</w:t>
+      </w:r>
       <w:r>
         <w:rPr>
           <w:rFonts w:asciiTheme="minorHAnsi" w:hAnsiTheme="minorHAnsi"/>
@@ -4982,6 +5414,7 @@
         <w:rPr>
           <w:rFonts w:asciiTheme="minorHAnsi" w:hAnsiTheme="minorHAnsi"/>
         </w:rPr>
+        <w:lastRenderedPageBreak/>
         <w:t>Review the update confirmation before proceeding because manual changes made directly to managed resources can be overwritten.</w:t>
       </w:r>
     </w:p>
@@ -5006,7 +5439,7 @@
           <w:rFonts w:asciiTheme="majorHAnsi" w:hAnsiTheme="majorHAnsi"/>
         </w:rPr>
       </w:pPr>
-      <w:bookmarkStart w:id="15" w:name="_Toc242260285"/>
+      <w:bookmarkStart w:id="15" w:name="_Toc242782518"/>
       <w:r>
         <w:rPr>
           <w:rFonts w:asciiTheme="majorHAnsi" w:hAnsiTheme="majorHAnsi"/>
@@ -5014,7 +5447,6 @@
           <w:bCs w:val="0"/>
           <w:color w:val="0F4761" w:themeColor="accent1" w:themeShade="BF"/>
         </w:rPr>
-        <w:lastRenderedPageBreak/>
         <w:t>Review the Lakehouse Output</w:t>
       </w:r>
       <w:bookmarkEnd w:id="15"/>
@@ -5186,7 +5618,7 @@
           <w:rFonts w:asciiTheme="majorHAnsi" w:hAnsiTheme="majorHAnsi"/>
         </w:rPr>
       </w:pPr>
-      <w:bookmarkStart w:id="16" w:name="_Toc242260286"/>
+      <w:bookmarkStart w:id="16" w:name="_Toc242782519"/>
       <w:r>
         <w:rPr>
           <w:rFonts w:asciiTheme="majorHAnsi" w:hAnsiTheme="majorHAnsi"/>
@@ -5586,7 +6018,7 @@
           <w:rFonts w:asciiTheme="majorHAnsi" w:hAnsiTheme="majorHAnsi"/>
         </w:rPr>
       </w:pPr>
-      <w:bookmarkStart w:id="17" w:name="_Toc242260287"/>
+      <w:bookmarkStart w:id="17" w:name="_Toc242782520"/>
       <w:r>
         <w:rPr>
           <w:rFonts w:asciiTheme="majorHAnsi" w:hAnsiTheme="majorHAnsi"/>
@@ -5594,9 +6026,138 @@
           <w:bCs w:val="0"/>
           <w:color w:val="0F4761" w:themeColor="accent1" w:themeShade="BF"/>
         </w:rPr>
+        <w:lastRenderedPageBreak/>
+        <w:t>Support, Licensing and Data Handling</w:t>
+      </w:r>
+      <w:bookmarkEnd w:id="17"/>
+    </w:p>
+    <w:p>
+      <w:pPr>
+        <w:pStyle w:val="ListParagraph"/>
+        <w:numPr>
+          <w:ilvl w:val="0"/>
+          <w:numId w:val="12"/>
+        </w:numPr>
+        <w:rPr>
+          <w:rFonts w:asciiTheme="minorHAnsi" w:hAnsiTheme="minorHAnsi"/>
+        </w:rPr>
+      </w:pPr>
+      <w:r>
+        <w:rPr>
+          <w:rFonts w:asciiTheme="minorHAnsi" w:hAnsiTheme="minorHAnsi"/>
+        </w:rPr>
+        <w:t xml:space="preserve">PAX Fabric is free and open source under the MIT License: </w:t>
+      </w:r>
+      <w:hyperlink r:id="rId11" w:history="1">
+        <w:r>
+          <w:rPr>
+            <w:rStyle w:val="Hyperlink"/>
+            <w:rFonts w:asciiTheme="minorHAnsi" w:hAnsiTheme="minorHAnsi"/>
+          </w:rPr>
+          <w:t>https://github.com/microsoft/PAX-Fabric/blob/main/LICENSE</w:t>
+        </w:r>
+      </w:hyperlink>
+    </w:p>
+    <w:p>
+      <w:pPr>
+        <w:pStyle w:val="ListParagraph"/>
+        <w:numPr>
+          <w:ilvl w:val="0"/>
+          <w:numId w:val="12"/>
+        </w:numPr>
+        <w:rPr>
+          <w:rFonts w:asciiTheme="minorHAnsi" w:hAnsiTheme="minorHAnsi"/>
+        </w:rPr>
+      </w:pPr>
+      <w:r>
+        <w:rPr>
+          <w:rFonts w:asciiTheme="minorHAnsi" w:hAnsiTheme="minorHAnsi"/>
+        </w:rPr>
+        <w:t xml:space="preserve">Report defects and request support through PAX-Fabric GitHub Issues: </w:t>
+      </w:r>
+      <w:hyperlink r:id="rId12" w:history="1">
+        <w:r>
+          <w:rPr>
+            <w:rStyle w:val="Hyperlink"/>
+            <w:rFonts w:asciiTheme="minorHAnsi" w:hAnsiTheme="minorHAnsi"/>
+          </w:rPr>
+          <w:t>https://github.com/microsoft/PAX-Fabric/issues</w:t>
+        </w:r>
+      </w:hyperlink>
+    </w:p>
+    <w:p>
+      <w:pPr>
+        <w:pStyle w:val="ListParagraph"/>
+        <w:numPr>
+          <w:ilvl w:val="0"/>
+          <w:numId w:val="12"/>
+        </w:numPr>
+        <w:rPr>
+          <w:rFonts w:asciiTheme="minorHAnsi" w:hAnsiTheme="minorHAnsi"/>
+        </w:rPr>
+      </w:pPr>
+      <w:r>
+        <w:rPr>
+          <w:rFonts w:asciiTheme="minorHAnsi" w:hAnsiTheme="minorHAnsi"/>
+        </w:rPr>
+        <w:t>Collected data and generated Delta tables remain in the customer's Microsoft Fabric tenant.</w:t>
+      </w:r>
+    </w:p>
+    <w:p>
+      <w:pPr>
+        <w:pStyle w:val="ListParagraph"/>
+        <w:numPr>
+          <w:ilvl w:val="0"/>
+          <w:numId w:val="12"/>
+        </w:numPr>
+        <w:rPr>
+          <w:rFonts w:asciiTheme="minorHAnsi" w:hAnsiTheme="minorHAnsi"/>
+        </w:rPr>
+      </w:pPr>
+      <w:r>
+        <w:rPr>
+          <w:rFonts w:asciiTheme="minorHAnsi" w:hAnsiTheme="minorHAnsi"/>
+        </w:rPr>
+        <w:t>The Notebook downloads the PAX Python package at run time from the public repository and GitHub Ref configured in the PAX item. The default ref is currently main.</w:t>
+      </w:r>
+    </w:p>
+    <w:p>
+      <w:pPr>
+        <w:pStyle w:val="ListParagraph"/>
+        <w:numPr>
+          <w:ilvl w:val="0"/>
+          <w:numId w:val="12"/>
+        </w:numPr>
+        <w:rPr>
+          <w:rFonts w:asciiTheme="minorHAnsi" w:hAnsiTheme="minorHAnsi"/>
+        </w:rPr>
+      </w:pPr>
+      <w:r>
+        <w:rPr>
+          <w:rFonts w:asciiTheme="minorHAnsi" w:hAnsiTheme="minorHAnsi"/>
+        </w:rPr>
+        <w:t>Pipeline and Notebook runs consume the customer's Fabric capacity.</w:t>
+      </w:r>
+    </w:p>
+    <w:p/>
+    <w:p>
+      <w:pPr>
+        <w:pStyle w:val="Heading1"/>
+        <w:rPr>
+          <w:rFonts w:asciiTheme="majorHAnsi" w:hAnsiTheme="majorHAnsi"/>
+        </w:rPr>
+      </w:pPr>
+      <w:bookmarkStart w:id="18" w:name="_Toc242782521"/>
+      <w:r>
+        <w:rPr>
+          <w:rFonts w:asciiTheme="majorHAnsi" w:hAnsiTheme="majorHAnsi"/>
+          <w:b w:val="0"/>
+          <w:bCs w:val="0"/>
+          <w:color w:val="0F4761" w:themeColor="accent1" w:themeShade="BF"/>
+        </w:rPr>
         <w:t>Related Fabric Resources</w:t>
       </w:r>
-      <w:bookmarkEnd w:id="17"/>
+      <w:bookmarkEnd w:id="18"/>
       <w:r>
         <w:rPr>
           <w:rFonts w:asciiTheme="majorHAnsi" w:hAnsiTheme="majorHAnsi"/>
@@ -5615,14 +6176,7 @@
         <w:rPr>
           <w:rFonts w:asciiTheme="minorHAnsi" w:hAnsiTheme="minorHAnsi"/>
         </w:rPr>
-        <w:t xml:space="preserve">The Variable Library, Lakehouse, Notebook, and Data Pipeline are separate Fabric items. Deleting the PAX Fabric Pipeline item should not be assumed to delete these </w:t>
-      </w:r>
-      <w:r>
-        <w:rPr>
-          <w:rFonts w:asciiTheme="minorHAnsi" w:hAnsiTheme="minorHAnsi"/>
-        </w:rPr>
-        <w:lastRenderedPageBreak/>
-        <w:t>resources. Review them individually and retain or remove them according to your requirements.</w:t>
+        <w:t>The Variable Library, Lakehouse, Notebook, and Data Pipeline are separate Fabric items. Deleting the PAX Fabric Pipeline item removes only that item; the four provisioned resources are retained. Review them individually and retain or remove them according to your requirements.</w:t>
       </w:r>
     </w:p>
     <w:sectPr>
@@ -5961,7 +6515,7 @@
   <w:abstractNum w:abstractNumId="3" w15:restartNumberingAfterBreak="0">
     <w:nsid w:val="265E1252"/>
     <w:multiLevelType w:val="hybridMultilevel"/>
-    <w:tmpl w:val="F238D35C"/>
+    <w:tmpl w:val="F856C36E"/>
     <w:lvl w:ilvl="0" w:tplc="40090001">
       <w:start w:val="1"/>
       <w:numFmt w:val="bullet"/>
@@ -6610,6 +7164,119 @@
     </w:lvl>
   </w:abstractNum>
   <w:abstractNum w:abstractNumId="9" w15:restartNumberingAfterBreak="0">
+    <w:nsid w:val="512E09B5"/>
+    <w:multiLevelType w:val="hybridMultilevel"/>
+    <w:tmpl w:val="180AA282"/>
+    <w:lvl w:ilvl="0" w:tplc="40090001">
+      <w:start w:val="1"/>
+      <w:numFmt w:val="bullet"/>
+      <w:lvlText w:val=""/>
+      <w:lvlJc w:val="left"/>
+      <w:pPr>
+        <w:ind w:left="720" w:hanging="360"/>
+      </w:pPr>
+      <w:rPr>
+        <w:rFonts w:ascii="Symbol" w:hAnsi="Symbol" w:hint="default"/>
+      </w:rPr>
+    </w:lvl>
+    <w:lvl w:ilvl="1" w:tplc="40090003" w:tentative="1">
+      <w:start w:val="1"/>
+      <w:numFmt w:val="bullet"/>
+      <w:lvlText w:val="o"/>
+      <w:lvlJc w:val="left"/>
+      <w:pPr>
+        <w:ind w:left="1440" w:hanging="360"/>
+      </w:pPr>
+      <w:rPr>
+        <w:rFonts w:ascii="Courier New" w:hAnsi="Courier New" w:cs="Courier New" w:hint="default"/>
+      </w:rPr>
+    </w:lvl>
+    <w:lvl w:ilvl="2" w:tplc="40090005" w:tentative="1">
+      <w:start w:val="1"/>
+      <w:numFmt w:val="bullet"/>
+      <w:lvlText w:val=""/>
+      <w:lvlJc w:val="left"/>
+      <w:pPr>
+        <w:ind w:left="2160" w:hanging="360"/>
+      </w:pPr>
+      <w:rPr>
+        <w:rFonts w:ascii="Wingdings" w:hAnsi="Wingdings" w:hint="default"/>
+      </w:rPr>
+    </w:lvl>
+    <w:lvl w:ilvl="3" w:tplc="40090001" w:tentative="1">
+      <w:start w:val="1"/>
+      <w:numFmt w:val="bullet"/>
+      <w:lvlText w:val=""/>
+      <w:lvlJc w:val="left"/>
+      <w:pPr>
+        <w:ind w:left="2880" w:hanging="360"/>
+      </w:pPr>
+      <w:rPr>
+        <w:rFonts w:ascii="Symbol" w:hAnsi="Symbol" w:hint="default"/>
+      </w:rPr>
+    </w:lvl>
+    <w:lvl w:ilvl="4" w:tplc="40090003" w:tentative="1">
+      <w:start w:val="1"/>
+      <w:numFmt w:val="bullet"/>
+      <w:lvlText w:val="o"/>
+      <w:lvlJc w:val="left"/>
+      <w:pPr>
+        <w:ind w:left="3600" w:hanging="360"/>
+      </w:pPr>
+      <w:rPr>
+        <w:rFonts w:ascii="Courier New" w:hAnsi="Courier New" w:cs="Courier New" w:hint="default"/>
+      </w:rPr>
+    </w:lvl>
+    <w:lvl w:ilvl="5" w:tplc="40090005" w:tentative="1">
+      <w:start w:val="1"/>
+      <w:numFmt w:val="bullet"/>
+      <w:lvlText w:val=""/>
+      <w:lvlJc w:val="left"/>
+      <w:pPr>
+        <w:ind w:left="4320" w:hanging="360"/>
+      </w:pPr>
+      <w:rPr>
+        <w:rFonts w:ascii="Wingdings" w:hAnsi="Wingdings" w:hint="default"/>
+      </w:rPr>
+    </w:lvl>
+    <w:lvl w:ilvl="6" w:tplc="40090001" w:tentative="1">
+      <w:start w:val="1"/>
+      <w:numFmt w:val="bullet"/>
+      <w:lvlText w:val=""/>
+      <w:lvlJc w:val="left"/>
+      <w:pPr>
+        <w:ind w:left="5040" w:hanging="360"/>
+      </w:pPr>
+      <w:rPr>
+        <w:rFonts w:ascii="Symbol" w:hAnsi="Symbol" w:hint="default"/>
+      </w:rPr>
+    </w:lvl>
+    <w:lvl w:ilvl="7" w:tplc="40090003" w:tentative="1">
+      <w:start w:val="1"/>
+      <w:numFmt w:val="bullet"/>
+      <w:lvlText w:val="o"/>
+      <w:lvlJc w:val="left"/>
+      <w:pPr>
+        <w:ind w:left="5760" w:hanging="360"/>
+      </w:pPr>
+      <w:rPr>
+        <w:rFonts w:ascii="Courier New" w:hAnsi="Courier New" w:cs="Courier New" w:hint="default"/>
+      </w:rPr>
+    </w:lvl>
+    <w:lvl w:ilvl="8" w:tplc="40090005" w:tentative="1">
+      <w:start w:val="1"/>
+      <w:numFmt w:val="bullet"/>
+      <w:lvlText w:val=""/>
+      <w:lvlJc w:val="left"/>
+      <w:pPr>
+        <w:ind w:left="6480" w:hanging="360"/>
+      </w:pPr>
+      <w:rPr>
+        <w:rFonts w:ascii="Wingdings" w:hAnsi="Wingdings" w:hint="default"/>
+      </w:rPr>
+    </w:lvl>
+  </w:abstractNum>
+  <w:abstractNum w:abstractNumId="10" w15:restartNumberingAfterBreak="0">
     <w:nsid w:val="62C4582D"/>
     <w:multiLevelType w:val="hybridMultilevel"/>
     <w:tmpl w:val="10EA660E"/>
@@ -6722,7 +7389,7 @@
       </w:rPr>
     </w:lvl>
   </w:abstractNum>
-  <w:abstractNum w:abstractNumId="10" w15:restartNumberingAfterBreak="0">
+  <w:abstractNum w:abstractNumId="11" w15:restartNumberingAfterBreak="0">
     <w:nsid w:val="63557594"/>
     <w:multiLevelType w:val="hybridMultilevel"/>
     <w:tmpl w:val="E0BC35E8"/>
@@ -6854,7 +7521,7 @@
     <w:abstractNumId w:val="3"/>
   </w:num>
   <w:num w:numId="5" w16cid:durableId="1909925542">
-    <w:abstractNumId w:val="10"/>
+    <w:abstractNumId w:val="11"/>
   </w:num>
   <w:num w:numId="6" w16cid:durableId="647784101">
     <w:abstractNumId w:val="1"/>
@@ -6869,10 +7536,13 @@
     <w:abstractNumId w:val="8"/>
   </w:num>
   <w:num w:numId="10" w16cid:durableId="606893359">
-    <w:abstractNumId w:val="9"/>
+    <w:abstractNumId w:val="10"/>
   </w:num>
   <w:num w:numId="11" w16cid:durableId="834145711">
     <w:abstractNumId w:val="4"/>
+  </w:num>
+  <w:num w:numId="12" w16cid:durableId="1949265288">
+    <w:abstractNumId w:val="9"/>
   </w:num>
 </w:numbering>
 </file>
@@ -7274,6 +7944,7 @@
   </w:style>
   <w:style w:type="paragraph" w:styleId="Heading1">
     <w:name w:val="heading 1"/>
+    <w:link w:val="Heading1Char"/>
     <w:uiPriority w:val="9"/>
     <w:qFormat/>
     <w:pPr>
@@ -7504,6 +8175,32 @@
       <w:spacing w:after="100"/>
       <w:ind w:left="240"/>
     </w:pPr>
+  </w:style>
+  <w:style w:type="character" w:customStyle="1" w:styleId="Heading1Char">
+    <w:name w:val="Heading 1 Char"/>
+    <w:basedOn w:val="DefaultParagraphFont"/>
+    <w:link w:val="Heading1"/>
+    <w:uiPriority w:val="9"/>
+    <w:rsid w:val="007656D9"/>
+    <w:rPr>
+      <w:b/>
+      <w:bCs/>
+      <w:color w:val="000000"/>
+      <w:sz w:val="40"/>
+      <w:szCs w:val="40"/>
+    </w:rPr>
+  </w:style>
+  <w:style w:type="character" w:styleId="UnresolvedMention">
+    <w:name w:val="Unresolved Mention"/>
+    <w:basedOn w:val="DefaultParagraphFont"/>
+    <w:uiPriority w:val="99"/>
+    <w:semiHidden/>
+    <w:unhideWhenUsed/>
+    <w:rsid w:val="007656D9"/>
+    <w:rPr>
+      <w:color w:val="605E5C"/>
+      <w:shd w:val="clear" w:color="auto" w:fill="E1DFDD"/>
+    </w:rPr>
   </w:style>
 </w:styles>
 </file>
@@ -7824,19 +8521,12 @@
 </file>
 
 <file path=customXml/item1.xml><?xml version="1.0" encoding="utf-8"?>
-<p:properties xmlns:p="http://schemas.microsoft.com/office/2006/metadata/properties" xmlns:xsi="http://www.w3.org/2001/XMLSchema-instance" xmlns:pc="http://schemas.microsoft.com/office/infopath/2007/PartnerControls">
-  <documentManagement>
-    <_ip_UnifiedCompliancePolicyUIAction xmlns="http://schemas.microsoft.com/sharepoint/v3" xsi:nil="true"/>
-    <ResourceNotes xmlns="63ff946b-e0e5-461a-af65-70becd25f341" xsi:nil="true"/>
-    <DigitalSignatureProvider xmlns="63ff946b-e0e5-461a-af65-70becd25f341" xsi:nil="true"/>
-    <TaxCatchAll xmlns="2023e23d-cb48-4528-a853-95d153887924" xsi:nil="true"/>
-    <_ip_UnifiedCompliancePolicyProperties xmlns="http://schemas.microsoft.com/sharepoint/v3" xsi:nil="true"/>
-    <HasDigitalSignature xmlns="63ff946b-e0e5-461a-af65-70becd25f341" xsi:nil="true"/>
-    <lcf76f155ced4ddcb4097134ff3c332f xmlns="63ff946b-e0e5-461a-af65-70becd25f341">
-      <Terms xmlns="http://schemas.microsoft.com/office/infopath/2007/PartnerControls"/>
-    </lcf76f155ced4ddcb4097134ff3c332f>
-  </documentManagement>
-</p:properties>
+<?mso-contentType ?>
+<FormTemplates xmlns="http://schemas.microsoft.com/sharepoint/v3/contenttype/forms">
+  <Display>DocumentLibraryForm</Display>
+  <Edit>DocumentLibraryForm</Edit>
+  <New>DocumentLibraryForm</New>
+</FormTemplates>
 </file>
 
 <file path=customXml/item2.xml><?xml version="1.0" encoding="utf-8"?>
@@ -8082,26 +8772,29 @@
 </file>
 
 <file path=customXml/item3.xml><?xml version="1.0" encoding="utf-8"?>
-<?mso-contentType ?>
-<FormTemplates xmlns="http://schemas.microsoft.com/sharepoint/v3/contenttype/forms">
-  <Display>DocumentLibraryForm</Display>
-  <Edit>DocumentLibraryForm</Edit>
-  <New>DocumentLibraryForm</New>
-</FormTemplates>
+<b:Sources xmlns:b="http://schemas.openxmlformats.org/officeDocument/2006/bibliography" xmlns="http://schemas.openxmlformats.org/officeDocument/2006/bibliography" SelectedStyle="\APASixthEditionOfficeOnline.xsl" StyleName="APA" Version="6"/>
 </file>
 
 <file path=customXml/item4.xml><?xml version="1.0" encoding="utf-8"?>
-<b:Sources xmlns:b="http://schemas.openxmlformats.org/officeDocument/2006/bibliography" xmlns="http://schemas.openxmlformats.org/officeDocument/2006/bibliography" SelectedStyle="\APASixthEditionOfficeOnline.xsl" StyleName="APA" Version="6"/>
+<p:properties xmlns:p="http://schemas.microsoft.com/office/2006/metadata/properties" xmlns:xsi="http://www.w3.org/2001/XMLSchema-instance" xmlns:pc="http://schemas.microsoft.com/office/infopath/2007/PartnerControls">
+  <documentManagement>
+    <_ip_UnifiedCompliancePolicyUIAction xmlns="http://schemas.microsoft.com/sharepoint/v3" xsi:nil="true"/>
+    <ResourceNotes xmlns="63ff946b-e0e5-461a-af65-70becd25f341" xsi:nil="true"/>
+    <DigitalSignatureProvider xmlns="63ff946b-e0e5-461a-af65-70becd25f341" xsi:nil="true"/>
+    <TaxCatchAll xmlns="2023e23d-cb48-4528-a853-95d153887924" xsi:nil="true"/>
+    <_ip_UnifiedCompliancePolicyProperties xmlns="http://schemas.microsoft.com/sharepoint/v3" xsi:nil="true"/>
+    <HasDigitalSignature xmlns="63ff946b-e0e5-461a-af65-70becd25f341" xsi:nil="true"/>
+    <lcf76f155ced4ddcb4097134ff3c332f xmlns="63ff946b-e0e5-461a-af65-70becd25f341">
+      <Terms xmlns="http://schemas.microsoft.com/office/infopath/2007/PartnerControls"/>
+    </lcf76f155ced4ddcb4097134ff3c332f>
+  </documentManagement>
+</p:properties>
 </file>
 
 <file path=customXml/itemProps1.xml><?xml version="1.0" encoding="utf-8"?>
-<ds:datastoreItem xmlns:ds="http://schemas.openxmlformats.org/officeDocument/2006/customXml" ds:itemID="{BDB471FA-E372-4AEB-B7F1-1E8DEAC2B9AB}">
+<ds:datastoreItem xmlns:ds="http://schemas.openxmlformats.org/officeDocument/2006/customXml" ds:itemID="{9C0A3961-F044-4F9C-BE3A-D1C8C827B60F}">
   <ds:schemaRefs>
-    <ds:schemaRef ds:uri="http://schemas.microsoft.com/office/2006/metadata/properties"/>
-    <ds:schemaRef ds:uri="http://schemas.microsoft.com/office/infopath/2007/PartnerControls"/>
-    <ds:schemaRef ds:uri="http://schemas.microsoft.com/sharepoint/v3"/>
-    <ds:schemaRef ds:uri="63ff946b-e0e5-461a-af65-70becd25f341"/>
-    <ds:schemaRef ds:uri="2023e23d-cb48-4528-a853-95d153887924"/>
+    <ds:schemaRef ds:uri="http://schemas.microsoft.com/sharepoint/v3/contenttype/forms"/>
   </ds:schemaRefs>
 </ds:datastoreItem>
 </file>
@@ -8127,17 +8820,21 @@
 </file>
 
 <file path=customXml/itemProps3.xml><?xml version="1.0" encoding="utf-8"?>
-<ds:datastoreItem xmlns:ds="http://schemas.openxmlformats.org/officeDocument/2006/customXml" ds:itemID="{9C0A3961-F044-4F9C-BE3A-D1C8C827B60F}">
+<ds:datastoreItem xmlns:ds="http://schemas.openxmlformats.org/officeDocument/2006/customXml" ds:itemID="{2BB64FA2-C6A1-4396-821A-395FB3A94806}">
   <ds:schemaRefs>
-    <ds:schemaRef ds:uri="http://schemas.microsoft.com/sharepoint/v3/contenttype/forms"/>
+    <ds:schemaRef ds:uri="http://schemas.openxmlformats.org/officeDocument/2006/bibliography"/>
   </ds:schemaRefs>
 </ds:datastoreItem>
 </file>
 
 <file path=customXml/itemProps4.xml><?xml version="1.0" encoding="utf-8"?>
-<ds:datastoreItem xmlns:ds="http://schemas.openxmlformats.org/officeDocument/2006/customXml" ds:itemID="{2BB64FA2-C6A1-4396-821A-395FB3A94806}">
+<ds:datastoreItem xmlns:ds="http://schemas.openxmlformats.org/officeDocument/2006/customXml" ds:itemID="{BDB471FA-E372-4AEB-B7F1-1E8DEAC2B9AB}">
   <ds:schemaRefs>
-    <ds:schemaRef ds:uri="http://schemas.openxmlformats.org/officeDocument/2006/bibliography"/>
+    <ds:schemaRef ds:uri="http://schemas.microsoft.com/office/2006/metadata/properties"/>
+    <ds:schemaRef ds:uri="http://schemas.microsoft.com/office/infopath/2007/PartnerControls"/>
+    <ds:schemaRef ds:uri="http://schemas.microsoft.com/sharepoint/v3"/>
+    <ds:schemaRef ds:uri="63ff946b-e0e5-461a-af65-70becd25f341"/>
+    <ds:schemaRef ds:uri="2023e23d-cb48-4528-a853-95d153887924"/>
   </ds:schemaRefs>
 </ds:datastoreItem>
 </file>

</xml_diff>